<commit_message>
word template rendering and download link
</commit_message>
<xml_diff>
--- a/docs/chapter_downloads/Quintana_GoFish_AgentBased_Models.docx
+++ b/docs/chapter_downloads/Quintana_GoFish_AgentBased_Models.docx
@@ -2,32 +2,6 @@
 <file path=word/document.xml><?xml version="1.0" encoding="utf-8"?>
 <w:document xmlns:w="http://schemas.openxmlformats.org/wordprocessingml/2006/main" xmlns:m="http://schemas.openxmlformats.org/officeDocument/2006/math" xmlns:r="http://schemas.openxmlformats.org/officeDocument/2006/relationships" xmlns:o="urn:schemas-microsoft-com:office:office" xmlns:v="urn:schemas-microsoft-com:vml" xmlns:w10="urn:schemas-microsoft-com:office:word" xmlns:a="http://schemas.openxmlformats.org/drawingml/2006/main" xmlns:pic="http://schemas.openxmlformats.org/drawingml/2006/picture" xmlns:wp="http://schemas.openxmlformats.org/drawingml/2006/wordprocessingDrawing">
   <w:body>
-    <w:sdt>
-      <w:sdtPr>
-        <w:docPartObj>
-          <w:docPartGallery w:val="Table of Contents"/>
-          <w:docPartUnique/>
-        </w:docPartObj>
-      </w:sdtPr>
-      <w:sdtContent>
-        <w:p>
-          <w:pPr>
-            <w:pStyle w:val="TOCHeading"/>
-          </w:pPr>
-          <w:r>
-            <w:t xml:space="preserve">Table of Contents</w:t>
-          </w:r>
-        </w:p>
-        <w:p>
-          <w:r>
-            <w:fldChar w:fldCharType="begin" w:dirty="true"/>
-            <w:instrText xml:space="preserve">TOC \o "1-3" \h \z \u</w:instrText>
-            <w:fldChar w:fldCharType="separate"/>
-            <w:fldChar w:fldCharType="end"/>
-          </w:r>
-        </w:p>
-      </w:sdtContent>
-    </w:sdt>
     <w:bookmarkStart w:id="12" w:name="agent-based-models"/>
     <w:p>
       <w:pPr>
@@ -354,9 +328,10 @@
     <w:bookmarkEnd w:id="11"/>
     <w:bookmarkEnd w:id="12"/>
     <w:sectPr>
-      <w:footnotePr>
-        <w:numRestart w:val="eachSect"/>
-      </w:footnotePr>
+      <w:pgSz w:h="15840" w:orient="portrait" w:w="12240"/>
+      <w:pgMar w:bottom="1440" w:footer="708" w:gutter="0" w:header="708" w:left="1440" w:right="1440" w:top="1440"/>
+      <w:pgNumType/>
+      <w:docGrid w:linePitch="360"/>
     </w:sectPr>
   </w:body>
 </w:document>
@@ -386,7 +361,107 @@
 </file>
 
 <file path=word/numbering.xml><?xml version="1.0" encoding="utf-8"?>
-<w:numbering xmlns:w="http://schemas.openxmlformats.org/wordprocessingml/2006/main">
+<w:numbering xmlns:m="http://schemas.openxmlformats.org/officeDocument/2006/math" xmlns:mc="http://schemas.openxmlformats.org/markup-compatibility/2006" xmlns:o="urn:schemas-microsoft-com:office:office" xmlns:r="http://schemas.openxmlformats.org/officeDocument/2006/relationships" xmlns:v="urn:schemas-microsoft-com:vml" xmlns:w="http://schemas.openxmlformats.org/wordprocessingml/2006/main" xmlns:w10="urn:schemas-microsoft-com:office:word" xmlns:w14="http://schemas.microsoft.com/office/word/2010/wordml" xmlns:w15="http://schemas.microsoft.com/office/word/2012/wordml" xmlns:wne="http://schemas.microsoft.com/office/word/2006/wordml" xmlns:wp="http://schemas.openxmlformats.org/drawingml/2006/wordprocessingDrawing" xmlns:wp14="http://schemas.microsoft.com/office/word/2010/wordprocessingDrawing" xmlns:wpc="http://schemas.microsoft.com/office/word/2010/wordprocessingCanvas" xmlns:wpg="http://schemas.microsoft.com/office/word/2010/wordprocessingGroup" xmlns:wpi="http://schemas.microsoft.com/office/word/2010/wordprocessingInk" xmlns:wps="http://schemas.microsoft.com/office/word/2010/wordprocessingShape" mc:Ignorable="w14 w15 wp14">
+  <w:abstractNum w15:restartNumberingAfterBreak="0" w:abstractNumId="1">
+    <w:multiLevelType w:val="hybridMultilevel"/>
+    <w:lvl w15:tentative="1" w:ilvl="0">
+      <w:start w:val="1"/>
+      <w:numFmt w:val="bullet"/>
+      <w:lvlText w:val="●"/>
+      <w:lvlJc w:val="left"/>
+      <w:pPr>
+        <w:ind w:hanging="360" w:left="720"/>
+      </w:pPr>
+    </w:lvl>
+    <w:lvl w15:tentative="1" w:ilvl="1">
+      <w:start w:val="1"/>
+      <w:numFmt w:val="bullet"/>
+      <w:lvlText w:val="○"/>
+      <w:lvlJc w:val="left"/>
+      <w:pPr>
+        <w:ind w:hanging="360" w:left="1440"/>
+      </w:pPr>
+    </w:lvl>
+    <w:lvl w15:tentative="1" w:ilvl="2">
+      <w:start w:val="1"/>
+      <w:numFmt w:val="bullet"/>
+      <w:lvlText w:val="■"/>
+      <w:lvlJc w:val="left"/>
+      <w:pPr>
+        <w:ind w:hanging="360" w:left="2160"/>
+      </w:pPr>
+    </w:lvl>
+    <w:lvl w15:tentative="1" w:ilvl="3">
+      <w:start w:val="1"/>
+      <w:numFmt w:val="bullet"/>
+      <w:lvlText w:val="●"/>
+      <w:lvlJc w:val="left"/>
+      <w:pPr>
+        <w:ind w:hanging="360" w:left="2880"/>
+      </w:pPr>
+    </w:lvl>
+    <w:lvl w15:tentative="1" w:ilvl="4">
+      <w:start w:val="1"/>
+      <w:numFmt w:val="bullet"/>
+      <w:lvlText w:val="○"/>
+      <w:lvlJc w:val="left"/>
+      <w:pPr>
+        <w:ind w:hanging="360" w:left="3600"/>
+      </w:pPr>
+    </w:lvl>
+    <w:lvl w15:tentative="1" w:ilvl="5">
+      <w:start w:val="1"/>
+      <w:numFmt w:val="bullet"/>
+      <w:lvlText w:val="■"/>
+      <w:lvlJc w:val="left"/>
+      <w:pPr>
+        <w:ind w:hanging="360" w:left="4320"/>
+      </w:pPr>
+    </w:lvl>
+    <w:lvl w15:tentative="1" w:ilvl="6">
+      <w:start w:val="1"/>
+      <w:numFmt w:val="bullet"/>
+      <w:lvlText w:val="●"/>
+      <w:lvlJc w:val="left"/>
+      <w:pPr>
+        <w:ind w:hanging="360" w:left="5040"/>
+      </w:pPr>
+    </w:lvl>
+    <w:lvl w15:tentative="1" w:ilvl="7">
+      <w:start w:val="1"/>
+      <w:numFmt w:val="bullet"/>
+      <w:lvlText w:val="●"/>
+      <w:lvlJc w:val="left"/>
+      <w:pPr>
+        <w:ind w:hanging="360" w:left="5760"/>
+      </w:pPr>
+    </w:lvl>
+    <w:lvl w15:tentative="1" w:ilvl="8">
+      <w:start w:val="1"/>
+      <w:numFmt w:val="bullet"/>
+      <w:lvlText w:val="●"/>
+      <w:lvlJc w:val="left"/>
+      <w:pPr>
+        <w:ind w:hanging="360" w:left="6480"/>
+      </w:pPr>
+    </w:lvl>
+  </w:abstractNum>
+  <w:abstractNum w15:restartNumberingAfterBreak="0" w:abstractNumId="2">
+    <w:multiLevelType w:val="hybridMultilevel"/>
+    <w:lvl w15:tentative="1" w:ilvl="0">
+      <w:start w:val="1"/>
+      <w:numFmt w:val="bullet"/>
+      <w:lvlText w:val="•"/>
+      <w:lvlJc w:val="left"/>
+      <w:pPr>
+        <w:ind w:hanging="360" w:left="720"/>
+      </w:pPr>
+      <w:rPr>
+        <w:rFonts w:ascii="Calibri" w:cs="Calibri" w:eastAsia="Calibri" w:hAnsi="Calibri"/>
+        <w:color w:val="0c7aba"/>
+      </w:rPr>
+    </w:lvl>
+  </w:abstractNum>
   <w:abstractNum w:abstractNumId="990">
     <w:nsid w:val="0000A990"/>
     <w:multiLevelType w:val="multilevel"/>
@@ -566,6 +641,12 @@
       </w:rPr>
     </w:lvl>
   </w:abstractNum>
+  <w:num w:numId="1">
+    <w:abstractNumId w:val="1"/>
+    <w:lvlOverride w:ilvl="0">
+      <w:startOverride w:val="1"/>
+    </w:lvlOverride>
+  </w:num>
   <w:num w:numId="1000">
     <w:abstractNumId w:val="990"/>
   </w:num>
@@ -579,659 +660,297 @@
 </file>
 
 <file path=word/styles.xml><?xml version="1.0" encoding="utf-8"?>
-<w:styles xmlns:r="http://schemas.openxmlformats.org/officeDocument/2006/relationships" xmlns:w="http://schemas.openxmlformats.org/wordprocessingml/2006/main">
+<w:styles xmlns:mc="http://schemas.openxmlformats.org/markup-compatibility/2006" xmlns:r="http://schemas.openxmlformats.org/officeDocument/2006/relationships" xmlns:w="http://schemas.openxmlformats.org/wordprocessingml/2006/main" xmlns:w14="http://schemas.microsoft.com/office/word/2010/wordml" xmlns:w15="http://schemas.microsoft.com/office/word/2012/wordml" mc:Ignorable="w14 w15">
   <w:docDefaults>
     <w:rPrDefault>
       <w:rPr>
-        <w:rFonts w:asciiTheme="minorHAnsi" w:cstheme="minorBidi" w:eastAsiaTheme="minorEastAsia" w:hAnsiTheme="minorHAnsi"/>
-        <w:sz w:val="24"/>
-        <w:szCs w:val="24"/>
-        <w:lang w:bidi="ar-SA" w:eastAsia="zh-CN" w:val="en-US"/>
+        <w:rFonts w:ascii="Calibri" w:cs="Calibri" w:eastAsia="Calibri" w:hAnsi="Calibri"/>
+        <w:color w:val="1a1a1a"/>
+        <w:sz w:val="22"/>
+        <w:szCs w:val="22"/>
       </w:rPr>
     </w:rPrDefault>
-    <w:pPrDefault>
-      <w:pPr>
-        <w:spacing w:after="200"/>
-      </w:pPr>
-    </w:pPrDefault>
+    <w:pPrDefault/>
   </w:docDefaults>
-  <w:latentStyles w:count="276" w:defLockedState="0" w:defQFormat="0" w:defSemiHidden="0" w:defUIPriority="0" w:defUnhideWhenUsed="0"/>
-  <w:style w:default="1" w:styleId="Normal" w:type="paragraph">
-    <w:name w:val="Normal"/>
+  <w:style w:styleId="Title" w:type="paragraph">
+    <w:name w:val="Title"/>
+    <w:basedOn w:val="Normal"/>
+    <w:next w:val="Normal"/>
     <w:qFormat/>
-  </w:style>
-  <w:style w:styleId="BodyText" w:type="paragraph">
-    <w:name w:val="Body Text"/>
-    <w:basedOn w:val="Normal"/>
-    <w:link w:val="BodyTextChar"/>
+    <w:rPr>
+      <w:sz w:val="56"/>
+      <w:szCs w:val="56"/>
+    </w:rPr>
+  </w:style>
+  <w:style w:styleId="Heading1" w:type="paragraph">
+    <w:name w:val="Heading 1"/>
+    <w:basedOn w:val="Normal"/>
+    <w:next w:val="Normal"/>
+    <w:qFormat/>
+    <w:rPr>
+      <w:color w:val="2E74B5"/>
+      <w:sz w:val="32"/>
+      <w:szCs w:val="32"/>
+    </w:rPr>
+  </w:style>
+  <w:style w:styleId="Heading2" w:type="paragraph">
+    <w:name w:val="Heading 2"/>
+    <w:basedOn w:val="Normal"/>
+    <w:next w:val="Normal"/>
+    <w:qFormat/>
+    <w:rPr>
+      <w:color w:val="2E74B5"/>
+      <w:sz w:val="26"/>
+      <w:szCs w:val="26"/>
+    </w:rPr>
+  </w:style>
+  <w:style w:styleId="Heading3" w:type="paragraph">
+    <w:name w:val="Heading 3"/>
+    <w:basedOn w:val="Normal"/>
+    <w:next w:val="Normal"/>
+    <w:qFormat/>
+    <w:rPr>
+      <w:color w:val="1F4D78"/>
+      <w:sz w:val="24"/>
+      <w:szCs w:val="24"/>
+    </w:rPr>
+  </w:style>
+  <w:style w:styleId="Heading4" w:type="paragraph">
+    <w:name w:val="Heading 4"/>
+    <w:basedOn w:val="Normal"/>
+    <w:next w:val="Normal"/>
+    <w:qFormat/>
+    <w:rPr>
+      <w:i/>
+      <w:iCs/>
+      <w:color w:val="2E74B5"/>
+    </w:rPr>
+  </w:style>
+  <w:style w:styleId="Heading5" w:type="paragraph">
+    <w:name w:val="Heading 5"/>
+    <w:basedOn w:val="Normal"/>
+    <w:next w:val="Normal"/>
+    <w:qFormat/>
+    <w:rPr>
+      <w:color w:val="2E74B5"/>
+    </w:rPr>
+  </w:style>
+  <w:style w:styleId="Heading6" w:type="paragraph">
+    <w:name w:val="Heading 6"/>
+    <w:basedOn w:val="Normal"/>
+    <w:next w:val="Normal"/>
+    <w:qFormat/>
+    <w:rPr>
+      <w:color w:val="1F4D78"/>
+    </w:rPr>
+  </w:style>
+  <w:style w:styleId="Strong" w:type="paragraph">
+    <w:name w:val="Strong"/>
+    <w:basedOn w:val="Normal"/>
+    <w:next w:val="Normal"/>
+    <w:qFormat/>
+    <w:rPr>
+      <w:b/>
+      <w:bCs/>
+    </w:rPr>
+  </w:style>
+  <w:style w:styleId="ListParagraph" w:type="paragraph">
+    <w:name w:val="List Paragraph"/>
+    <w:basedOn w:val="Normal"/>
+    <w:qFormat/>
+  </w:style>
+  <w:style w:styleId="Hyperlink" w:type="character">
+    <w:name w:val="Hyperlink"/>
+    <w:basedOn w:val="DefaultParagraphFont"/>
+    <w:uiPriority w:val="99"/>
+    <w:unhideWhenUsed/>
+    <w:rPr>
+      <w:color w:val="0563C1"/>
+      <w:u w:val="single"/>
+    </w:rPr>
+  </w:style>
+  <w:style w:styleId="FootnoteReference" w:type="character">
+    <w:name w:val="footnote reference"/>
+    <w:basedOn w:val="DefaultParagraphFont"/>
+    <w:uiPriority w:val="99"/>
+    <w:semiHidden/>
+    <w:unhideWhenUsed/>
+    <w:rPr>
+      <w:vertAlign w:val="superscript"/>
+    </w:rPr>
+  </w:style>
+  <w:style w:styleId="FootnoteText" w:type="paragraph">
+    <w:name w:val="footnote text"/>
+    <w:basedOn w:val="Normal"/>
+    <w:link w:val="FootnoteTextChar"/>
+    <w:uiPriority w:val="99"/>
+    <w:semiHidden/>
+    <w:unhideWhenUsed/>
+    <w:pPr>
+      <w:spacing w:after="0" w:line="240" w:lineRule="auto"/>
+    </w:pPr>
+    <w:rPr>
+      <w:sz w:val="20"/>
+      <w:szCs w:val="20"/>
+    </w:rPr>
+  </w:style>
+  <w:style w:styleId="FootnoteTextChar" w:type="character">
+    <w:name w:val="Footnote Text Char"/>
+    <w:basedOn w:val="DefaultParagraphFont"/>
+    <w:link w:val="FootnoteText"/>
+    <w:uiPriority w:val="99"/>
+    <w:semiHidden/>
+    <w:unhideWhenUsed/>
+    <w:rPr>
+      <w:sz w:val="20"/>
+      <w:szCs w:val="20"/>
+    </w:rPr>
+  </w:style>
+  <w:style w:styleId="EndnoteReference" w:type="character">
+    <w:name w:val="endnote reference"/>
+    <w:basedOn w:val="DefaultParagraphFont"/>
+    <w:uiPriority w:val="99"/>
+    <w:semiHidden/>
+    <w:unhideWhenUsed/>
+    <w:rPr>
+      <w:vertAlign w:val="superscript"/>
+    </w:rPr>
+  </w:style>
+  <w:style w:styleId="EndnoteText" w:type="paragraph">
+    <w:name w:val="endnote text"/>
+    <w:basedOn w:val="Normal"/>
+    <w:link w:val="EndnoteTextChar"/>
+    <w:uiPriority w:val="99"/>
+    <w:semiHidden/>
+    <w:unhideWhenUsed/>
+    <w:pPr>
+      <w:spacing w:after="0" w:line="240" w:lineRule="auto"/>
+    </w:pPr>
+    <w:rPr>
+      <w:sz w:val="20"/>
+      <w:szCs w:val="20"/>
+    </w:rPr>
+  </w:style>
+  <w:style w:styleId="EndnoteTextChar" w:type="character">
+    <w:name w:val="Endnote Text Char"/>
+    <w:basedOn w:val="DefaultParagraphFont"/>
+    <w:link w:val="EndnoteText"/>
+    <w:uiPriority w:val="99"/>
+    <w:semiHidden/>
+    <w:unhideWhenUsed/>
+    <w:rPr>
+      <w:sz w:val="20"/>
+      <w:szCs w:val="20"/>
+    </w:rPr>
+  </w:style>
+  <w:style w:styleId="Heading1" w:type="paragraph">
+    <w:name w:val="Heading 1"/>
+    <w:basedOn w:val="Normal"/>
+    <w:next w:val="Normal"/>
     <w:qFormat/>
     <w:pPr>
-      <w:spacing w:after="180" w:before="180"/>
+      <w:pBdr>
+        <w:bottom w:color="1e90ff" w:space="4" w:sz="6" w:val="single"/>
+      </w:pBdr>
+      <w:spacing w:after="240" w:before="480"/>
+      <w:outlineLvl w:val="0"/>
     </w:pPr>
-  </w:style>
-  <w:style w:customStyle="1" w:styleId="FirstParagraph" w:type="paragraph">
-    <w:name w:val="First Paragraph"/>
-    <w:basedOn w:val="BodyText"/>
-    <w:next w:val="BodyText"/>
-    <w:qFormat/>
-  </w:style>
-  <w:style w:customStyle="1" w:styleId="Compact" w:type="paragraph">
-    <w:name w:val="Compact"/>
-    <w:basedOn w:val="BodyText"/>
+    <w:rPr>
+      <w:rFonts w:ascii="Calibri" w:cs="Calibri" w:eastAsia="Calibri" w:hAnsi="Calibri"/>
+      <w:b/>
+      <w:bCs/>
+      <w:color w:val="0a3d62"/>
+      <w:sz w:val="44"/>
+      <w:szCs w:val="44"/>
+    </w:rPr>
+  </w:style>
+  <w:style w:styleId="Heading2" w:type="paragraph">
+    <w:name w:val="Heading 2"/>
+    <w:basedOn w:val="Normal"/>
+    <w:next w:val="Normal"/>
     <w:qFormat/>
     <w:pPr>
-      <w:spacing w:after="36" w:before="36"/>
+      <w:pBdr>
+        <w:bottom w:color="e8f4fd" w:space="2" w:sz="3" w:val="single"/>
+      </w:pBdr>
+      <w:spacing w:after="160" w:before="320"/>
+      <w:outlineLvl w:val="1"/>
     </w:pPr>
-  </w:style>
-  <w:style w:styleId="Title" w:type="paragraph">
-    <w:name w:val="Title"/>
-    <w:basedOn w:val="Normal"/>
-    <w:next w:val="BodyText"/>
-    <w:link w:val="TitleChar"/>
-    <w:uiPriority w:val="10"/>
-    <w:qFormat/>
-    <w:rsid w:val="00A10FD9"/>
-    <w:pPr>
-      <w:spacing w:after="80" w:line="240" w:lineRule="auto"/>
-      <w:contextualSpacing/>
-      <w:jc w:val="center"/>
-    </w:pPr>
-    <w:rPr>
-      <w:rFonts w:asciiTheme="majorHAnsi" w:cstheme="majorBidi" w:eastAsiaTheme="majorEastAsia" w:hAnsiTheme="majorHAnsi"/>
-      <w:sz w:val="56"/>
-      <w:szCs w:val="56"/>
-    </w:rPr>
-  </w:style>
-  <w:style w:customStyle="1" w:styleId="TitleChar" w:type="character">
-    <w:name w:val="Title Char"/>
-    <w:basedOn w:val="DefaultParagraphFont"/>
-    <w:link w:val="Title"/>
-    <w:uiPriority w:val="10"/>
-    <w:rsid w:val="00A10FD9"/>
-    <w:rPr>
-      <w:rFonts w:asciiTheme="majorHAnsi" w:cstheme="majorBidi" w:eastAsiaTheme="majorEastAsia" w:hAnsiTheme="majorHAnsi"/>
-      <w:sz w:val="56"/>
-      <w:szCs w:val="56"/>
-    </w:rPr>
-  </w:style>
-  <w:style w:styleId="Subtitle" w:type="paragraph">
-    <w:name w:val="Subtitle"/>
-    <w:basedOn w:val="Title"/>
-    <w:next w:val="BodyText"/>
-    <w:link w:val="SubtitleChar"/>
-    <w:uiPriority w:val="11"/>
-    <w:qFormat/>
-    <w:rsid w:val="00A10FD9"/>
-    <w:pPr>
-      <w:numPr>
-        <w:ilvl w:val="1"/>
-      </w:numPr>
-    </w:pPr>
-    <w:rPr>
-      <w:rFonts w:cstheme="majorBidi" w:eastAsiaTheme="majorEastAsia"/>
-      <w:spacing w:val="15"/>
-      <w:sz w:val="28"/>
-      <w:szCs w:val="28"/>
-    </w:rPr>
-  </w:style>
-  <w:style w:customStyle="1" w:styleId="SubtitleChar" w:type="character">
-    <w:name w:val="Subtitle Char"/>
-    <w:basedOn w:val="DefaultParagraphFont"/>
-    <w:link w:val="Subtitle"/>
-    <w:uiPriority w:val="11"/>
-    <w:rsid w:val="00A10FD9"/>
-    <w:rPr>
-      <w:rFonts w:cstheme="majorBidi" w:eastAsiaTheme="majorEastAsia"/>
-      <w:color w:themeColor="text1" w:themeTint="A6" w:val="595959"/>
-      <w:spacing w:val="15"/>
-      <w:sz w:val="28"/>
-      <w:szCs w:val="28"/>
-    </w:rPr>
-  </w:style>
-  <w:style w:customStyle="1" w:styleId="Author" w:type="paragraph">
-    <w:name w:val="Author"/>
-    <w:basedOn w:val="Title"/>
-    <w:next w:val="BodyText"/>
+    <w:rPr>
+      <w:rFonts w:ascii="Calibri" w:cs="Calibri" w:eastAsia="Calibri" w:hAnsi="Calibri"/>
+      <w:b/>
+      <w:bCs/>
+      <w:color w:val="0a3d62"/>
+      <w:sz w:val="32"/>
+      <w:szCs w:val="32"/>
+    </w:rPr>
+  </w:style>
+  <w:style w:styleId="Heading3" w:type="paragraph">
+    <w:name w:val="Heading 3"/>
+    <w:basedOn w:val="Normal"/>
+    <w:next w:val="Normal"/>
     <w:qFormat/>
     <w:pPr>
-      <w:keepNext/>
-      <w:keepLines/>
+      <w:spacing w:after="120" w:before="240"/>
+      <w:outlineLvl w:val="2"/>
     </w:pPr>
     <w:rPr>
+      <w:rFonts w:ascii="Calibri" w:cs="Calibri" w:eastAsia="Calibri" w:hAnsi="Calibri"/>
+      <w:b/>
+      <w:bCs/>
+      <w:color w:val="0c7aba"/>
+      <w:sz w:val="26"/>
+      <w:szCs w:val="26"/>
+    </w:rPr>
+  </w:style>
+  <w:style w:styleId="Heading4" w:type="paragraph">
+    <w:name w:val="Heading 4"/>
+    <w:basedOn w:val="Normal"/>
+    <w:next w:val="Normal"/>
+    <w:qFormat/>
+    <w:pPr>
+      <w:spacing w:after="80" w:before="160"/>
+      <w:outlineLvl w:val="3"/>
+    </w:pPr>
+    <w:rPr>
+      <w:rFonts w:ascii="Calibri" w:cs="Calibri" w:eastAsia="Calibri" w:hAnsi="Calibri"/>
+      <w:b/>
+      <w:bCs/>
+      <w:i/>
+      <w:iCs/>
+      <w:color w:val="0c7aba"/>
       <w:sz w:val="24"/>
       <w:szCs w:val="24"/>
     </w:rPr>
   </w:style>
-  <w:style w:styleId="Date" w:type="paragraph">
-    <w:name w:val="Date"/>
-    <w:basedOn w:val="Title"/>
-    <w:next w:val="BodyText"/>
-    <w:qFormat/>
+  <w:style w:styleId="Normal" w:type="paragraph">
+    <w:name w:val="Normal"/>
     <w:pPr>
-      <w:keepNext/>
-      <w:keepLines/>
+      <w:spacing w:after="160" w:line="276"/>
     </w:pPr>
     <w:rPr>
-      <w:sz w:val="24"/>
-      <w:szCs w:val="24"/>
-    </w:rPr>
-  </w:style>
-  <w:style w:customStyle="1" w:styleId="AbstractTitle" w:type="paragraph">
-    <w:name w:val="Abstract Title"/>
-    <w:basedOn w:val="Normal"/>
-    <w:next w:val="Abstract"/>
-    <w:qFormat/>
+      <w:rFonts w:ascii="Calibri" w:cs="Calibri" w:eastAsia="Calibri" w:hAnsi="Calibri"/>
+      <w:color w:val="1a1a1a"/>
+      <w:sz w:val="22"/>
+      <w:szCs w:val="22"/>
+    </w:rPr>
+  </w:style>
+  <w:style w:styleId="verbatim" w:type="paragraph">
+    <w:name w:val="verbatim"/>
+    <w:basedOn w:val="Normal"/>
     <w:pPr>
-      <w:keepNext/>
-      <w:keepLines/>
-      <w:spacing w:after="0" w:before="300"/>
-      <w:jc w:val="center"/>
+      <w:pBdr>
+        <w:left w:color="1e90ff" w:space="6" w:sz="12" w:val="single"/>
+      </w:pBdr>
+      <w:shd w:fill="e8f4fd" w:val="clear"/>
+      <w:spacing w:after="120" w:before="120"/>
+      <w:ind w:left="360"/>
     </w:pPr>
     <w:rPr>
-      <w:b/>
-      <w:sz w:val="20"/>
-      <w:szCs w:val="20"/>
-    </w:rPr>
-  </w:style>
-  <w:style w:customStyle="1" w:styleId="Abstract" w:type="paragraph">
-    <w:name w:val="Abstract"/>
-    <w:basedOn w:val="Normal"/>
-    <w:next w:val="BodyText"/>
-    <w:qFormat/>
-    <w:pPr>
-      <w:keepNext/>
-      <w:keepLines/>
-      <w:spacing w:after="300" w:before="100"/>
-    </w:pPr>
-    <w:rPr>
-      <w:sz w:val="20"/>
-      <w:szCs w:val="20"/>
-    </w:rPr>
-  </w:style>
-  <w:style w:styleId="Bibliography" w:type="paragraph">
-    <w:name w:val="Bibliography"/>
-    <w:basedOn w:val="Normal"/>
-    <w:next w:val="Bibliography"/>
-    <w:qFormat/>
-    <w:pPr/>
-    <w:rPr/>
-  </w:style>
-  <w:style w:styleId="Heading1" w:type="paragraph">
-    <w:name w:val="heading 1"/>
-    <w:basedOn w:val="Normal"/>
-    <w:next w:val="BodyText"/>
-    <w:link w:val="Heading1Char"/>
-    <w:uiPriority w:val="9"/>
-    <w:qFormat/>
-    <w:rsid w:val="00A10FD9"/>
-    <w:pPr>
-      <w:keepNext/>
-      <w:keepLines/>
-      <w:spacing w:after="80" w:before="360"/>
-      <w:outlineLvl w:val="0"/>
-    </w:pPr>
-    <w:rPr>
-      <w:rFonts w:asciiTheme="majorHAnsi" w:cstheme="majorBidi" w:eastAsiaTheme="majorEastAsia" w:hAnsiTheme="majorHAnsi"/>
-      <w:color w:themeColor="accent1" w:themeShade="BF" w:val="0F4761"/>
-      <w:sz w:val="40"/>
-      <w:szCs w:val="40"/>
-    </w:rPr>
-  </w:style>
-  <w:style w:styleId="Heading2" w:type="paragraph">
-    <w:name w:val="heading 2"/>
-    <w:basedOn w:val="Normal"/>
-    <w:next w:val="BodyText"/>
-    <w:link w:val="Heading2Char"/>
-    <w:uiPriority w:val="9"/>
-    <w:semiHidden/>
-    <w:unhideWhenUsed/>
-    <w:qFormat/>
-    <w:rsid w:val="00A10FD9"/>
-    <w:pPr>
-      <w:keepNext/>
-      <w:keepLines/>
-      <w:spacing w:after="80" w:before="160"/>
-      <w:outlineLvl w:val="1"/>
-    </w:pPr>
-    <w:rPr>
-      <w:rFonts w:asciiTheme="majorHAnsi" w:cstheme="majorBidi" w:eastAsiaTheme="majorEastAsia" w:hAnsiTheme="majorHAnsi"/>
-      <w:color w:themeColor="accent1" w:themeShade="BF" w:val="0F4761"/>
-      <w:sz w:val="32"/>
-      <w:szCs w:val="32"/>
-    </w:rPr>
-  </w:style>
-  <w:style w:styleId="Heading3" w:type="paragraph">
-    <w:name w:val="heading 3"/>
-    <w:basedOn w:val="Normal"/>
-    <w:next w:val="BodyText"/>
-    <w:link w:val="Heading3Char"/>
-    <w:uiPriority w:val="9"/>
-    <w:semiHidden/>
-    <w:unhideWhenUsed/>
-    <w:qFormat/>
-    <w:rsid w:val="00A10FD9"/>
-    <w:pPr>
-      <w:keepNext/>
-      <w:keepLines/>
-      <w:spacing w:after="80" w:before="160"/>
-      <w:outlineLvl w:val="2"/>
-    </w:pPr>
-    <w:rPr>
-      <w:rFonts w:cstheme="majorBidi" w:eastAsiaTheme="majorEastAsia"/>
-      <w:color w:themeColor="accent1" w:themeShade="BF" w:val="0F4761"/>
-      <w:sz w:val="28"/>
-      <w:szCs w:val="28"/>
-    </w:rPr>
-  </w:style>
-  <w:style w:styleId="Heading4" w:type="paragraph">
-    <w:name w:val="heading 4"/>
-    <w:basedOn w:val="Normal"/>
-    <w:next w:val="BodyText"/>
-    <w:link w:val="Heading4Char"/>
-    <w:uiPriority w:val="9"/>
-    <w:semiHidden/>
-    <w:unhideWhenUsed/>
-    <w:qFormat/>
-    <w:rsid w:val="00A10FD9"/>
-    <w:pPr>
-      <w:keepNext/>
-      <w:keepLines/>
-      <w:spacing w:after="40" w:before="80"/>
-      <w:outlineLvl w:val="3"/>
-    </w:pPr>
-    <w:rPr>
-      <w:rFonts w:cstheme="majorBidi" w:eastAsiaTheme="majorEastAsia"/>
-      <w:i/>
-      <w:iCs/>
-      <w:color w:themeColor="accent1" w:themeShade="BF" w:val="0F4761"/>
-    </w:rPr>
-  </w:style>
-  <w:style w:styleId="Heading5" w:type="paragraph">
-    <w:name w:val="heading 5"/>
-    <w:basedOn w:val="Normal"/>
-    <w:next w:val="BodyText"/>
-    <w:link w:val="Heading5Char"/>
-    <w:uiPriority w:val="9"/>
-    <w:semiHidden/>
-    <w:unhideWhenUsed/>
-    <w:qFormat/>
-    <w:rsid w:val="00A10FD9"/>
-    <w:pPr>
-      <w:keepNext/>
-      <w:keepLines/>
-      <w:spacing w:after="40" w:before="80"/>
-      <w:outlineLvl w:val="4"/>
-    </w:pPr>
-    <w:rPr>
-      <w:rFonts w:cstheme="majorBidi" w:eastAsiaTheme="majorEastAsia"/>
-      <w:color w:themeColor="accent1" w:themeShade="BF" w:val="0F4761"/>
-    </w:rPr>
-  </w:style>
-  <w:style w:styleId="Heading6" w:type="paragraph">
-    <w:name w:val="heading 6"/>
-    <w:basedOn w:val="Normal"/>
-    <w:next w:val="BodyText"/>
-    <w:link w:val="Heading6Char"/>
-    <w:uiPriority w:val="9"/>
-    <w:semiHidden/>
-    <w:unhideWhenUsed/>
-    <w:qFormat/>
-    <w:rsid w:val="00A10FD9"/>
-    <w:pPr>
-      <w:keepNext/>
-      <w:keepLines/>
-      <w:spacing w:after="0" w:before="40"/>
-      <w:outlineLvl w:val="5"/>
-    </w:pPr>
-    <w:rPr>
-      <w:rFonts w:cstheme="majorBidi" w:eastAsiaTheme="majorEastAsia"/>
-      <w:i/>
-      <w:iCs/>
-      <w:color w:themeColor="text1" w:themeTint="A6" w:val="595959"/>
-    </w:rPr>
-  </w:style>
-  <w:style w:styleId="Heading7" w:type="paragraph">
-    <w:name w:val="heading 7"/>
-    <w:basedOn w:val="Normal"/>
-    <w:next w:val="BodyText"/>
-    <w:link w:val="Heading7Char"/>
-    <w:uiPriority w:val="9"/>
-    <w:semiHidden/>
-    <w:unhideWhenUsed/>
-    <w:qFormat/>
-    <w:rsid w:val="00A10FD9"/>
-    <w:pPr>
-      <w:keepNext/>
-      <w:keepLines/>
-      <w:spacing w:after="0" w:before="40"/>
-      <w:outlineLvl w:val="6"/>
-    </w:pPr>
-    <w:rPr>
-      <w:rFonts w:cstheme="majorBidi" w:eastAsiaTheme="majorEastAsia"/>
-      <w:color w:themeColor="text1" w:themeTint="A6" w:val="595959"/>
-    </w:rPr>
-  </w:style>
-  <w:style w:styleId="Heading8" w:type="paragraph">
-    <w:name w:val="heading 8"/>
-    <w:basedOn w:val="Normal"/>
-    <w:next w:val="BodyText"/>
-    <w:link w:val="Heading8Char"/>
-    <w:uiPriority w:val="9"/>
-    <w:semiHidden/>
-    <w:unhideWhenUsed/>
-    <w:qFormat/>
-    <w:rsid w:val="00A10FD9"/>
-    <w:pPr>
-      <w:keepNext/>
-      <w:keepLines/>
-      <w:spacing w:after="0"/>
-      <w:outlineLvl w:val="7"/>
-    </w:pPr>
-    <w:rPr>
-      <w:rFonts w:cstheme="majorBidi" w:eastAsiaTheme="majorEastAsia"/>
-      <w:i/>
-      <w:iCs/>
-      <w:color w:themeColor="text1" w:themeTint="D8" w:val="272727"/>
-    </w:rPr>
-  </w:style>
-  <w:style w:styleId="Heading9" w:type="paragraph">
-    <w:name w:val="heading 9"/>
-    <w:basedOn w:val="Normal"/>
-    <w:next w:val="BodyText"/>
-    <w:link w:val="Heading9Char"/>
-    <w:uiPriority w:val="9"/>
-    <w:semiHidden/>
-    <w:unhideWhenUsed/>
-    <w:qFormat/>
-    <w:rsid w:val="00A10FD9"/>
-    <w:pPr>
-      <w:keepNext/>
-      <w:keepLines/>
-      <w:spacing w:after="0"/>
-      <w:outlineLvl w:val="8"/>
-    </w:pPr>
-    <w:rPr>
-      <w:rFonts w:cstheme="majorBidi" w:eastAsiaTheme="majorEastAsia"/>
-      <w:color w:themeColor="text1" w:themeTint="D8" w:val="272727"/>
-    </w:rPr>
-  </w:style>
-  <w:style w:customStyle="1" w:styleId="Heading1Char" w:type="character">
-    <w:name w:val="Heading 1 Char"/>
-    <w:basedOn w:val="DefaultParagraphFont"/>
-    <w:link w:val="Heading1"/>
-    <w:uiPriority w:val="9"/>
-    <w:rsid w:val="00A10FD9"/>
-    <w:rPr>
-      <w:rFonts w:asciiTheme="majorHAnsi" w:cstheme="majorBidi" w:eastAsiaTheme="majorEastAsia" w:hAnsiTheme="majorHAnsi"/>
-      <w:color w:themeColor="accent1" w:themeShade="BF" w:val="0F4761"/>
-      <w:sz w:val="40"/>
-      <w:szCs w:val="40"/>
-    </w:rPr>
-  </w:style>
-  <w:style w:customStyle="1" w:styleId="Heading2Char" w:type="character">
-    <w:name w:val="Heading 2 Char"/>
-    <w:basedOn w:val="DefaultParagraphFont"/>
-    <w:link w:val="Heading2"/>
-    <w:uiPriority w:val="9"/>
-    <w:semiHidden/>
-    <w:rsid w:val="00A10FD9"/>
-    <w:rPr>
-      <w:rFonts w:asciiTheme="majorHAnsi" w:cstheme="majorBidi" w:eastAsiaTheme="majorEastAsia" w:hAnsiTheme="majorHAnsi"/>
-      <w:color w:themeColor="accent1" w:themeShade="BF" w:val="0F4761"/>
-      <w:sz w:val="32"/>
-      <w:szCs w:val="32"/>
-    </w:rPr>
-  </w:style>
-  <w:style w:customStyle="1" w:styleId="Heading3Char" w:type="character">
-    <w:name w:val="Heading 3 Char"/>
-    <w:basedOn w:val="DefaultParagraphFont"/>
-    <w:link w:val="Heading3"/>
-    <w:uiPriority w:val="9"/>
-    <w:semiHidden/>
-    <w:rsid w:val="00A10FD9"/>
-    <w:rPr>
-      <w:rFonts w:cstheme="majorBidi" w:eastAsiaTheme="majorEastAsia"/>
-      <w:color w:themeColor="accent1" w:themeShade="BF" w:val="0F4761"/>
-      <w:sz w:val="28"/>
-      <w:szCs w:val="28"/>
-    </w:rPr>
-  </w:style>
-  <w:style w:customStyle="1" w:styleId="Heading4Char" w:type="character">
-    <w:name w:val="Heading 4 Char"/>
-    <w:basedOn w:val="DefaultParagraphFont"/>
-    <w:link w:val="Heading4"/>
-    <w:uiPriority w:val="9"/>
-    <w:semiHidden/>
-    <w:rsid w:val="00A10FD9"/>
-    <w:rPr>
-      <w:rFonts w:cstheme="majorBidi" w:eastAsiaTheme="majorEastAsia"/>
-      <w:i/>
-      <w:iCs/>
-      <w:color w:themeColor="accent1" w:themeShade="BF" w:val="0F4761"/>
-    </w:rPr>
-  </w:style>
-  <w:style w:customStyle="1" w:styleId="Heading5Char" w:type="character">
-    <w:name w:val="Heading 5 Char"/>
-    <w:basedOn w:val="DefaultParagraphFont"/>
-    <w:link w:val="Heading5"/>
-    <w:uiPriority w:val="9"/>
-    <w:semiHidden/>
-    <w:rsid w:val="00A10FD9"/>
-    <w:rPr>
-      <w:rFonts w:cstheme="majorBidi" w:eastAsiaTheme="majorEastAsia"/>
-      <w:color w:themeColor="accent1" w:themeShade="BF" w:val="0F4761"/>
-    </w:rPr>
-  </w:style>
-  <w:style w:customStyle="1" w:styleId="Heading6Char" w:type="character">
-    <w:name w:val="Heading 6 Char"/>
-    <w:basedOn w:val="DefaultParagraphFont"/>
-    <w:link w:val="Heading6"/>
-    <w:uiPriority w:val="9"/>
-    <w:semiHidden/>
-    <w:rsid w:val="00A10FD9"/>
-    <w:rPr>
-      <w:rFonts w:cstheme="majorBidi" w:eastAsiaTheme="majorEastAsia"/>
-      <w:i/>
-      <w:iCs/>
-      <w:color w:themeColor="text1" w:themeTint="A6" w:val="595959"/>
-    </w:rPr>
-  </w:style>
-  <w:style w:customStyle="1" w:styleId="Heading7Char" w:type="character">
-    <w:name w:val="Heading 7 Char"/>
-    <w:basedOn w:val="DefaultParagraphFont"/>
-    <w:link w:val="Heading7"/>
-    <w:uiPriority w:val="9"/>
-    <w:semiHidden/>
-    <w:rsid w:val="00A10FD9"/>
-    <w:rPr>
-      <w:rFonts w:cstheme="majorBidi" w:eastAsiaTheme="majorEastAsia"/>
-      <w:color w:themeColor="text1" w:themeTint="A6" w:val="595959"/>
-    </w:rPr>
-  </w:style>
-  <w:style w:customStyle="1" w:styleId="Heading8Char" w:type="character">
-    <w:name w:val="Heading 8 Char"/>
-    <w:basedOn w:val="DefaultParagraphFont"/>
-    <w:link w:val="Heading8"/>
-    <w:uiPriority w:val="9"/>
-    <w:semiHidden/>
-    <w:rsid w:val="00A10FD9"/>
-    <w:rPr>
-      <w:rFonts w:cstheme="majorBidi" w:eastAsiaTheme="majorEastAsia"/>
-      <w:i/>
-      <w:iCs/>
-      <w:color w:themeColor="text1" w:themeTint="D8" w:val="272727"/>
-    </w:rPr>
-  </w:style>
-  <w:style w:customStyle="1" w:styleId="Heading9Char" w:type="character">
-    <w:name w:val="Heading 9 Char"/>
-    <w:basedOn w:val="DefaultParagraphFont"/>
-    <w:link w:val="Heading9"/>
-    <w:uiPriority w:val="9"/>
-    <w:semiHidden/>
-    <w:rsid w:val="00A10FD9"/>
-    <w:rPr>
-      <w:rFonts w:cstheme="majorBidi" w:eastAsiaTheme="majorEastAsia"/>
-      <w:color w:themeColor="text1" w:themeTint="D8" w:val="272727"/>
-    </w:rPr>
-  </w:style>
-  <w:style w:styleId="BlockText" w:type="paragraph">
-    <w:name w:val="Block Text"/>
-    <w:basedOn w:val="BodyText"/>
-    <w:next w:val="BodyText"/>
-    <w:uiPriority w:val="9"/>
-    <w:unhideWhenUsed/>
-    <w:qFormat/>
-    <w:pPr>
-      <w:spacing w:after="100" w:before="100"/>
-      <w:ind w:firstLine="0" w:left="480" w:right="480"/>
-    </w:pPr>
-  </w:style>
-  <w:style w:styleId="FootnoteText" w:type="paragraph">
-    <w:name w:val="Footnote Text"/>
-    <w:basedOn w:val="Normal"/>
-    <w:next w:val="FootnoteText"/>
-    <w:uiPriority w:val="9"/>
-    <w:unhideWhenUsed/>
-    <w:qFormat/>
-  </w:style>
-  <w:style w:styleId="FootnoteBlockText" w:type="paragraph">
-    <w:name w:val="Footnote Block Text"/>
-    <w:basedOn w:val="FootnoteText"/>
-    <w:next w:val="FootnoteText"/>
-    <w:uiPriority w:val="9"/>
-    <w:unhideWhenUsed/>
-    <w:qFormat/>
-    <w:pPr>
-      <w:spacing w:after="100" w:before="100"/>
-      <w:ind w:firstLine="0" w:left="480" w:right="480"/>
-    </w:pPr>
-  </w:style>
-  <w:style w:default="1" w:styleId="DefaultParagraphFont" w:type="character">
-    <w:name w:val="Default Paragraph Font"/>
-    <w:semiHidden/>
-    <w:unhideWhenUsed/>
-  </w:style>
-  <w:style w:default="1" w:styleId="Table" w:type="table">
-    <w:name w:val="Table"/>
-    <w:basedOn w:val="TableNormal"/>
-    <w:semiHidden/>
-    <w:unhideWhenUsed/>
-    <w:qFormat/>
-    <w:tblPr>
-      <w:tblInd w:type="dxa" w:w="0"/>
-      <w:tblCellMar>
-        <w:top w:type="dxa" w:w="0"/>
-        <w:left w:type="dxa" w:w="108"/>
-        <w:bottom w:type="dxa" w:w="0"/>
-        <w:right w:type="dxa" w:w="108"/>
-      </w:tblCellMar>
-    </w:tblPr>
-    <w:tblStylePr w:type="firstRow">
-      <w:tcPr>
-        <w:tcBorders>
-          <w:bottom w:val="single"/>
-        </w:tcBorders>
-        <w:vAlign w:val="bottom"/>
-      </w:tcPr>
-    </w:tblStylePr>
-  </w:style>
-  <w:style w:customStyle="1" w:styleId="DefinitionTerm" w:type="paragraph">
-    <w:name w:val="Definition Term"/>
-    <w:basedOn w:val="Normal"/>
-    <w:next w:val="Definition"/>
-    <w:pPr>
-      <w:keepNext/>
-      <w:keepLines/>
-      <w:spacing w:after="0"/>
-    </w:pPr>
-    <w:rPr>
-      <w:b/>
-    </w:rPr>
-  </w:style>
-  <w:style w:customStyle="1" w:styleId="Definition" w:type="paragraph">
-    <w:name w:val="Definition"/>
-    <w:basedOn w:val="Normal"/>
-  </w:style>
-  <w:style w:styleId="Caption" w:type="paragraph">
-    <w:name w:val="Caption"/>
-    <w:basedOn w:val="Normal"/>
-    <w:link w:val="BodyTextChar"/>
-    <w:pPr>
-      <w:spacing w:after="120" w:before="0"/>
-    </w:pPr>
-    <w:rPr>
-      <w:i/>
-    </w:rPr>
-  </w:style>
-  <w:style w:customStyle="1" w:styleId="TableCaption" w:type="paragraph">
-    <w:name w:val="Table Caption"/>
-    <w:basedOn w:val="Caption"/>
-    <w:pPr>
-      <w:keepNext/>
-    </w:pPr>
-  </w:style>
-  <w:style w:customStyle="1" w:styleId="ImageCaption" w:type="paragraph">
-    <w:name w:val="Image Caption"/>
-    <w:basedOn w:val="Caption"/>
-  </w:style>
-  <w:style w:customStyle="1" w:styleId="Figure" w:type="paragraph">
-    <w:name w:val="Figure"/>
-    <w:basedOn w:val="Normal"/>
-  </w:style>
-  <w:style w:customStyle="1" w:styleId="CaptionedFigure" w:type="paragraph">
-    <w:name w:val="Captioned Figure"/>
-    <w:basedOn w:val="Figure"/>
-    <w:pPr>
-      <w:keepNext/>
-    </w:pPr>
-  </w:style>
-  <w:style w:customStyle="1" w:styleId="BodyTextChar" w:type="character">
-    <w:name w:val="Body Text Char"/>
-    <w:basedOn w:val="DefaultParagraphFont"/>
-    <w:link w:val="BodyText"/>
-  </w:style>
-  <w:style w:customStyle="1" w:styleId="VerbatimChar" w:type="character">
-    <w:name w:val="Verbatim Char"/>
-    <w:basedOn w:val="BodyTextChar"/>
-    <w:rPr>
-      <w:rFonts w:ascii="Consolas" w:hAnsi="Consolas"/>
-      <w:sz w:val="22"/>
-    </w:rPr>
-  </w:style>
-  <w:style w:customStyle="1" w:styleId="SectionNumber" w:type="character">
-    <w:name w:val="Section Number"/>
-    <w:basedOn w:val="BodyTextChar"/>
-  </w:style>
-  <w:style w:styleId="FootnoteReference" w:type="character">
-    <w:name w:val="Footnote Reference"/>
-    <w:basedOn w:val="BodyTextChar"/>
-    <w:rPr>
-      <w:vertAlign w:val="superscript"/>
-    </w:rPr>
-  </w:style>
-  <w:style w:styleId="Hyperlink" w:type="character">
-    <w:name w:val="Hyperlink"/>
-    <w:basedOn w:val="BodyTextChar"/>
-    <w:rPr>
-      <w:color w:themeColor="accent1" w:val="4F81BD"/>
-    </w:rPr>
-  </w:style>
-  <w:style w:styleId="TOCHeading" w:type="paragraph">
-    <w:name w:val="TOC Heading"/>
-    <w:basedOn w:val="Heading1"/>
-    <w:next w:val="BodyText"/>
-    <w:uiPriority w:val="39"/>
-    <w:unhideWhenUsed/>
-    <w:qFormat/>
-    <w:pPr>
-      <w:spacing w:before="240" w:line="259" w:lineRule="auto"/>
-      <w:outlineLvl w:val="9"/>
-    </w:pPr>
-    <w:rPr>
-      <w:rFonts w:asciiTheme="majorHAnsi" w:cstheme="majorBidi" w:eastAsiaTheme="majorEastAsia" w:hAnsiTheme="majorHAnsi"/>
-      <w:b w:val="0"/>
-      <w:bCs w:val="0"/>
-      <w:color w:themeColor="accent1" w:themeShade="BF" w:val="365F91"/>
+      <w:rFonts w:ascii="Courier New" w:cs="Courier New" w:eastAsia="Courier New" w:hAnsi="Courier New"/>
+      <w:color w:val="0a3d62"/>
+      <w:sz w:val="18"/>
+      <w:szCs w:val="18"/>
     </w:rPr>
   </w:style>
   <w:style w:type="paragraph" w:customStyle="1" w:styleId="SourceCode">

</xml_diff>

<commit_message>
update build file to rendere references and abide by template
</commit_message>
<xml_diff>
--- a/docs/chapter_downloads/Quintana_GoFish_AgentBased_Models.docx
+++ b/docs/chapter_downloads/Quintana_GoFish_AgentBased_Models.docx
@@ -328,9 +328,9 @@
     <w:bookmarkEnd w:id="11"/>
     <w:bookmarkEnd w:id="12"/>
     <w:sectPr>
-      <w:pgSz w:h="15840" w:orient="portrait" w:w="12240"/>
+      <w:pgSz w:h="15840" w:w="12240"/>
       <w:pgMar w:bottom="1440" w:footer="708" w:gutter="0" w:header="708" w:left="1440" w:right="1440" w:top="1440"/>
-      <w:pgNumType/>
+      <w:cols w:space="720"/>
       <w:docGrid w:linePitch="360"/>
     </w:sectPr>
   </w:body>
@@ -361,10 +361,70 @@
 </file>
 
 <file path=word/numbering.xml><?xml version="1.0" encoding="utf-8"?>
-<w:numbering xmlns:m="http://schemas.openxmlformats.org/officeDocument/2006/math" xmlns:mc="http://schemas.openxmlformats.org/markup-compatibility/2006" xmlns:o="urn:schemas-microsoft-com:office:office" xmlns:r="http://schemas.openxmlformats.org/officeDocument/2006/relationships" xmlns:v="urn:schemas-microsoft-com:vml" xmlns:w="http://schemas.openxmlformats.org/wordprocessingml/2006/main" xmlns:w10="urn:schemas-microsoft-com:office:word" xmlns:w14="http://schemas.microsoft.com/office/word/2010/wordml" xmlns:w15="http://schemas.microsoft.com/office/word/2012/wordml" xmlns:wne="http://schemas.microsoft.com/office/word/2006/wordml" xmlns:wp="http://schemas.openxmlformats.org/drawingml/2006/wordprocessingDrawing" xmlns:wp14="http://schemas.microsoft.com/office/word/2010/wordprocessingDrawing" xmlns:wpc="http://schemas.microsoft.com/office/word/2010/wordprocessingCanvas" xmlns:wpg="http://schemas.microsoft.com/office/word/2010/wordprocessingGroup" xmlns:wpi="http://schemas.microsoft.com/office/word/2010/wordprocessingInk" xmlns:wps="http://schemas.microsoft.com/office/word/2010/wordprocessingShape" mc:Ignorable="w14 w15 wp14">
+<w:numbering xmlns:aink="http://schemas.microsoft.com/office/drawing/2016/ink" xmlns:am3d="http://schemas.microsoft.com/office/drawing/2017/model3d" xmlns:cx="http://schemas.microsoft.com/office/drawing/2014/chartex" xmlns:cx1="http://schemas.microsoft.com/office/drawing/2015/9/8/chartex" xmlns:cx2="http://schemas.microsoft.com/office/drawing/2015/10/21/chartex" xmlns:cx3="http://schemas.microsoft.com/office/drawing/2016/5/9/chartex" xmlns:cx4="http://schemas.microsoft.com/office/drawing/2016/5/10/chartex" xmlns:cx5="http://schemas.microsoft.com/office/drawing/2016/5/11/chartex" xmlns:cx6="http://schemas.microsoft.com/office/drawing/2016/5/12/chartex" xmlns:cx7="http://schemas.microsoft.com/office/drawing/2016/5/13/chartex" xmlns:cx8="http://schemas.microsoft.com/office/drawing/2016/5/14/chartex" xmlns:m="http://schemas.openxmlformats.org/officeDocument/2006/math" xmlns:mc="http://schemas.openxmlformats.org/markup-compatibility/2006" xmlns:o="urn:schemas-microsoft-com:office:office" xmlns:r="http://schemas.openxmlformats.org/officeDocument/2006/relationships" xmlns:v="urn:schemas-microsoft-com:vml" xmlns:w="http://schemas.openxmlformats.org/wordprocessingml/2006/main" xmlns:w10="urn:schemas-microsoft-com:office:word" xmlns:w14="http://schemas.microsoft.com/office/word/2010/wordml" xmlns:w15="http://schemas.microsoft.com/office/word/2012/wordml" xmlns:w16="http://schemas.microsoft.com/office/word/2018/wordml" xmlns:w16cex="http://schemas.microsoft.com/office/word/2018/wordml/cex" xmlns:w16cid="http://schemas.microsoft.com/office/word/2016/wordml/cid" xmlns:w16sdtdh="http://schemas.microsoft.com/office/word/2020/wordml/sdtdatahash" xmlns:w16se="http://schemas.microsoft.com/office/word/2015/wordml/symex" xmlns:wne="http://schemas.microsoft.com/office/word/2006/wordml" xmlns:wp="http://schemas.openxmlformats.org/drawingml/2006/wordprocessingDrawing" xmlns:wp14="http://schemas.microsoft.com/office/word/2010/wordprocessingDrawing" xmlns:wpc="http://schemas.microsoft.com/office/word/2010/wordprocessingCanvas" xmlns:wpg="http://schemas.microsoft.com/office/word/2010/wordprocessingGroup" xmlns:wpi="http://schemas.microsoft.com/office/word/2010/wordprocessingInk" xmlns:wps="http://schemas.microsoft.com/office/word/2010/wordprocessingShape" mc:Ignorable="w14 w15 w16se w16cid w16 w16cex w16sdtdh wp14">
+  <w:abstractNum w15:restartNumberingAfterBreak="0" w:abstractNumId="0">
+    <w:nsid w:val="3F002B30"/>
+    <w:multiLevelType w:val="hybridMultilevel"/>
+    <w:tmpl w:val="3B1AA620"/>
+    <w:lvl w:ilvl="0" w:tplc="CD4211B2">
+      <w:start w:val="1"/>
+      <w:numFmt w:val="bullet"/>
+      <w:lvlText w:val="•"/>
+      <w:lvlJc w:val="left"/>
+      <w:pPr>
+        <w:ind w:hanging="360" w:left="720"/>
+      </w:pPr>
+      <w:rPr>
+        <w:rFonts w:ascii="Calibri" w:cs="Calibri" w:eastAsia="Calibri" w:hAnsi="Calibri"/>
+        <w:color w:val="0C7ABA"/>
+      </w:rPr>
+    </w:lvl>
+    <w:lvl w:ilvl="1" w:tplc="20C8ED5C">
+      <w:numFmt w:val="decimal"/>
+      <w:lvlText w:val=""/>
+      <w:lvlJc w:val="left"/>
+    </w:lvl>
+    <w:lvl w:ilvl="2" w:tplc="75164A96">
+      <w:numFmt w:val="decimal"/>
+      <w:lvlText w:val=""/>
+      <w:lvlJc w:val="left"/>
+    </w:lvl>
+    <w:lvl w:ilvl="3" w:tplc="C5668DB8">
+      <w:numFmt w:val="decimal"/>
+      <w:lvlText w:val=""/>
+      <w:lvlJc w:val="left"/>
+    </w:lvl>
+    <w:lvl w:ilvl="4" w:tplc="4FDC3A46">
+      <w:numFmt w:val="decimal"/>
+      <w:lvlText w:val=""/>
+      <w:lvlJc w:val="left"/>
+    </w:lvl>
+    <w:lvl w:ilvl="5" w:tplc="E29638F6">
+      <w:numFmt w:val="decimal"/>
+      <w:lvlText w:val=""/>
+      <w:lvlJc w:val="left"/>
+    </w:lvl>
+    <w:lvl w:ilvl="6" w:tplc="BA5C1422">
+      <w:numFmt w:val="decimal"/>
+      <w:lvlText w:val=""/>
+      <w:lvlJc w:val="left"/>
+    </w:lvl>
+    <w:lvl w:ilvl="7" w:tplc="E4D69DDC">
+      <w:numFmt w:val="decimal"/>
+      <w:lvlText w:val=""/>
+      <w:lvlJc w:val="left"/>
+    </w:lvl>
+    <w:lvl w:ilvl="8" w:tplc="9C168A2C">
+      <w:numFmt w:val="decimal"/>
+      <w:lvlText w:val=""/>
+      <w:lvlJc w:val="left"/>
+    </w:lvl>
+  </w:abstractNum>
   <w:abstractNum w15:restartNumberingAfterBreak="0" w:abstractNumId="1">
+    <w:nsid w:val="5FE22841"/>
     <w:multiLevelType w:val="hybridMultilevel"/>
-    <w:lvl w15:tentative="1" w:ilvl="0">
+    <w:tmpl w:val="0B8429B0"/>
+    <w:lvl w:ilvl="0" w:tplc="B8F65D48">
       <w:start w:val="1"/>
       <w:numFmt w:val="bullet"/>
       <w:lvlText w:val="●"/>
@@ -373,7 +433,7 @@
         <w:ind w:hanging="360" w:left="720"/>
       </w:pPr>
     </w:lvl>
-    <w:lvl w15:tentative="1" w:ilvl="1">
+    <w:lvl w:ilvl="1" w:tplc="07AEFD42">
       <w:start w:val="1"/>
       <w:numFmt w:val="bullet"/>
       <w:lvlText w:val="○"/>
@@ -382,7 +442,7 @@
         <w:ind w:hanging="360" w:left="1440"/>
       </w:pPr>
     </w:lvl>
-    <w:lvl w15:tentative="1" w:ilvl="2">
+    <w:lvl w:ilvl="2" w:tplc="887ED00C">
       <w:start w:val="1"/>
       <w:numFmt w:val="bullet"/>
       <w:lvlText w:val="■"/>
@@ -391,7 +451,7 @@
         <w:ind w:hanging="360" w:left="2160"/>
       </w:pPr>
     </w:lvl>
-    <w:lvl w15:tentative="1" w:ilvl="3">
+    <w:lvl w:ilvl="3" w:tplc="04941B82">
       <w:start w:val="1"/>
       <w:numFmt w:val="bullet"/>
       <w:lvlText w:val="●"/>
@@ -400,7 +460,7 @@
         <w:ind w:hanging="360" w:left="2880"/>
       </w:pPr>
     </w:lvl>
-    <w:lvl w15:tentative="1" w:ilvl="4">
+    <w:lvl w:ilvl="4" w:tplc="D4E887E8">
       <w:start w:val="1"/>
       <w:numFmt w:val="bullet"/>
       <w:lvlText w:val="○"/>
@@ -409,7 +469,7 @@
         <w:ind w:hanging="360" w:left="3600"/>
       </w:pPr>
     </w:lvl>
-    <w:lvl w15:tentative="1" w:ilvl="5">
+    <w:lvl w:ilvl="5" w:tplc="6D9EB200">
       <w:start w:val="1"/>
       <w:numFmt w:val="bullet"/>
       <w:lvlText w:val="■"/>
@@ -418,7 +478,7 @@
         <w:ind w:hanging="360" w:left="4320"/>
       </w:pPr>
     </w:lvl>
-    <w:lvl w15:tentative="1" w:ilvl="6">
+    <w:lvl w:ilvl="6" w:tplc="4DCA9382">
       <w:start w:val="1"/>
       <w:numFmt w:val="bullet"/>
       <w:lvlText w:val="●"/>
@@ -427,7 +487,7 @@
         <w:ind w:hanging="360" w:left="5040"/>
       </w:pPr>
     </w:lvl>
-    <w:lvl w15:tentative="1" w:ilvl="7">
+    <w:lvl w:ilvl="7" w:tplc="607E2C94">
       <w:start w:val="1"/>
       <w:numFmt w:val="bullet"/>
       <w:lvlText w:val="●"/>
@@ -436,7 +496,7 @@
         <w:ind w:hanging="360" w:left="5760"/>
       </w:pPr>
     </w:lvl>
-    <w:lvl w15:tentative="1" w:ilvl="8">
+    <w:lvl w:ilvl="8" w:tplc="B8BCA7A8">
       <w:start w:val="1"/>
       <w:numFmt w:val="bullet"/>
       <w:lvlText w:val="●"/>
@@ -444,22 +504,6 @@
       <w:pPr>
         <w:ind w:hanging="360" w:left="6480"/>
       </w:pPr>
-    </w:lvl>
-  </w:abstractNum>
-  <w:abstractNum w15:restartNumberingAfterBreak="0" w:abstractNumId="2">
-    <w:multiLevelType w:val="hybridMultilevel"/>
-    <w:lvl w15:tentative="1" w:ilvl="0">
-      <w:start w:val="1"/>
-      <w:numFmt w:val="bullet"/>
-      <w:lvlText w:val="•"/>
-      <w:lvlJc w:val="left"/>
-      <w:pPr>
-        <w:ind w:hanging="360" w:left="720"/>
-      </w:pPr>
-      <w:rPr>
-        <w:rFonts w:ascii="Calibri" w:cs="Calibri" w:eastAsia="Calibri" w:hAnsi="Calibri"/>
-        <w:color w:val="0c7aba"/>
-      </w:rPr>
     </w:lvl>
   </w:abstractNum>
   <w:abstractNum w:abstractNumId="990">
@@ -660,92 +704,557 @@
 </file>
 
 <file path=word/styles.xml><?xml version="1.0" encoding="utf-8"?>
-<w:styles xmlns:mc="http://schemas.openxmlformats.org/markup-compatibility/2006" xmlns:r="http://schemas.openxmlformats.org/officeDocument/2006/relationships" xmlns:w="http://schemas.openxmlformats.org/wordprocessingml/2006/main" xmlns:w14="http://schemas.microsoft.com/office/word/2010/wordml" xmlns:w15="http://schemas.microsoft.com/office/word/2012/wordml" mc:Ignorable="w14 w15">
+<w:styles xmlns:mc="http://schemas.openxmlformats.org/markup-compatibility/2006" xmlns:r="http://schemas.openxmlformats.org/officeDocument/2006/relationships" xmlns:w="http://schemas.openxmlformats.org/wordprocessingml/2006/main" xmlns:w14="http://schemas.microsoft.com/office/word/2010/wordml" xmlns:w15="http://schemas.microsoft.com/office/word/2012/wordml" xmlns:w16="http://schemas.microsoft.com/office/word/2018/wordml" xmlns:w16cex="http://schemas.microsoft.com/office/word/2018/wordml/cex" xmlns:w16cid="http://schemas.microsoft.com/office/word/2016/wordml/cid" xmlns:w16sdtdh="http://schemas.microsoft.com/office/word/2020/wordml/sdtdatahash" xmlns:w16se="http://schemas.microsoft.com/office/word/2015/wordml/symex" mc:Ignorable="w14 w15 w16se w16cid w16 w16cex w16sdtdh">
   <w:docDefaults>
     <w:rPrDefault>
       <w:rPr>
         <w:rFonts w:ascii="Calibri" w:cs="Calibri" w:eastAsia="Calibri" w:hAnsi="Calibri"/>
-        <w:color w:val="1a1a1a"/>
+        <w:color w:val="1A1A1A"/>
         <w:sz w:val="22"/>
         <w:szCs w:val="22"/>
+        <w:lang w:bidi="ar-SA" w:eastAsia="en-US" w:val="en-US"/>
       </w:rPr>
     </w:rPrDefault>
     <w:pPrDefault/>
   </w:docDefaults>
+  <w:latentStyles w:count="376" w:defLockedState="0" w:defQFormat="0" w:defSemiHidden="0" w:defUIPriority="99" w:defUnhideWhenUsed="0">
+    <w:lsdException w:name="Normal" w:qFormat="1" w:uiPriority="0"/>
+    <w:lsdException w:name="heading 1" w:qFormat="1" w:uiPriority="9"/>
+    <w:lsdException w:name="heading 2" w:qFormat="1" w:semiHidden="1" w:uiPriority="9" w:unhideWhenUsed="1"/>
+    <w:lsdException w:name="heading 3" w:qFormat="1" w:semiHidden="1" w:uiPriority="9" w:unhideWhenUsed="1"/>
+    <w:lsdException w:name="heading 4" w:qFormat="1" w:semiHidden="1" w:uiPriority="9" w:unhideWhenUsed="1"/>
+    <w:lsdException w:name="heading 5" w:qFormat="1" w:semiHidden="1" w:uiPriority="9" w:unhideWhenUsed="1"/>
+    <w:lsdException w:name="heading 6" w:qFormat="1" w:semiHidden="1" w:uiPriority="9" w:unhideWhenUsed="1"/>
+    <w:lsdException w:name="heading 7" w:qFormat="1" w:semiHidden="1" w:uiPriority="9" w:unhideWhenUsed="1"/>
+    <w:lsdException w:name="heading 8" w:qFormat="1" w:semiHidden="1" w:uiPriority="9" w:unhideWhenUsed="1"/>
+    <w:lsdException w:name="heading 9" w:qFormat="1" w:semiHidden="1" w:uiPriority="9" w:unhideWhenUsed="1"/>
+    <w:lsdException w:name="index 1" w:semiHidden="1" w:unhideWhenUsed="1"/>
+    <w:lsdException w:name="index 2" w:semiHidden="1" w:unhideWhenUsed="1"/>
+    <w:lsdException w:name="index 3" w:semiHidden="1" w:unhideWhenUsed="1"/>
+    <w:lsdException w:name="index 4" w:semiHidden="1" w:unhideWhenUsed="1"/>
+    <w:lsdException w:name="index 5" w:semiHidden="1" w:unhideWhenUsed="1"/>
+    <w:lsdException w:name="index 6" w:semiHidden="1" w:unhideWhenUsed="1"/>
+    <w:lsdException w:name="index 7" w:semiHidden="1" w:unhideWhenUsed="1"/>
+    <w:lsdException w:name="index 8" w:semiHidden="1" w:unhideWhenUsed="1"/>
+    <w:lsdException w:name="index 9" w:semiHidden="1" w:unhideWhenUsed="1"/>
+    <w:lsdException w:name="toc 1" w:semiHidden="1" w:uiPriority="39" w:unhideWhenUsed="1"/>
+    <w:lsdException w:name="toc 2" w:semiHidden="1" w:uiPriority="39" w:unhideWhenUsed="1"/>
+    <w:lsdException w:name="toc 3" w:semiHidden="1" w:uiPriority="39" w:unhideWhenUsed="1"/>
+    <w:lsdException w:name="toc 4" w:semiHidden="1" w:uiPriority="39" w:unhideWhenUsed="1"/>
+    <w:lsdException w:name="toc 5" w:semiHidden="1" w:uiPriority="39" w:unhideWhenUsed="1"/>
+    <w:lsdException w:name="toc 6" w:semiHidden="1" w:uiPriority="39" w:unhideWhenUsed="1"/>
+    <w:lsdException w:name="toc 7" w:semiHidden="1" w:uiPriority="39" w:unhideWhenUsed="1"/>
+    <w:lsdException w:name="toc 8" w:semiHidden="1" w:uiPriority="39" w:unhideWhenUsed="1"/>
+    <w:lsdException w:name="toc 9" w:semiHidden="1" w:uiPriority="39" w:unhideWhenUsed="1"/>
+    <w:lsdException w:name="Normal Indent" w:semiHidden="1" w:unhideWhenUsed="1"/>
+    <w:lsdException w:name="footnote text" w:semiHidden="1" w:unhideWhenUsed="1"/>
+    <w:lsdException w:name="annotation text" w:semiHidden="1" w:unhideWhenUsed="1"/>
+    <w:lsdException w:name="header" w:semiHidden="1" w:unhideWhenUsed="1"/>
+    <w:lsdException w:name="footer" w:semiHidden="1" w:unhideWhenUsed="1"/>
+    <w:lsdException w:name="index heading" w:semiHidden="1" w:unhideWhenUsed="1"/>
+    <w:lsdException w:name="caption" w:qFormat="1" w:semiHidden="1" w:uiPriority="35" w:unhideWhenUsed="1"/>
+    <w:lsdException w:name="table of figures" w:semiHidden="1" w:unhideWhenUsed="1"/>
+    <w:lsdException w:name="envelope address" w:semiHidden="1" w:unhideWhenUsed="1"/>
+    <w:lsdException w:name="envelope return" w:semiHidden="1" w:unhideWhenUsed="1"/>
+    <w:lsdException w:name="footnote reference" w:semiHidden="1" w:unhideWhenUsed="1"/>
+    <w:lsdException w:name="annotation reference" w:semiHidden="1" w:unhideWhenUsed="1"/>
+    <w:lsdException w:name="line number" w:semiHidden="1" w:unhideWhenUsed="1"/>
+    <w:lsdException w:name="page number" w:semiHidden="1" w:unhideWhenUsed="1"/>
+    <w:lsdException w:name="endnote reference" w:semiHidden="1" w:unhideWhenUsed="1"/>
+    <w:lsdException w:name="endnote text" w:semiHidden="1" w:unhideWhenUsed="1"/>
+    <w:lsdException w:name="table of authorities" w:semiHidden="1" w:unhideWhenUsed="1"/>
+    <w:lsdException w:name="macro" w:semiHidden="1" w:unhideWhenUsed="1"/>
+    <w:lsdException w:name="toa heading" w:semiHidden="1" w:unhideWhenUsed="1"/>
+    <w:lsdException w:name="List" w:semiHidden="1" w:unhideWhenUsed="1"/>
+    <w:lsdException w:name="List Bullet" w:semiHidden="1" w:unhideWhenUsed="1"/>
+    <w:lsdException w:name="List Number" w:semiHidden="1" w:unhideWhenUsed="1"/>
+    <w:lsdException w:name="List 2" w:semiHidden="1" w:unhideWhenUsed="1"/>
+    <w:lsdException w:name="List 3" w:semiHidden="1" w:unhideWhenUsed="1"/>
+    <w:lsdException w:name="List 4" w:semiHidden="1" w:unhideWhenUsed="1"/>
+    <w:lsdException w:name="List 5" w:semiHidden="1" w:unhideWhenUsed="1"/>
+    <w:lsdException w:name="List Bullet 2" w:semiHidden="1" w:unhideWhenUsed="1"/>
+    <w:lsdException w:name="List Bullet 3" w:semiHidden="1" w:unhideWhenUsed="1"/>
+    <w:lsdException w:name="List Bullet 4" w:semiHidden="1" w:unhideWhenUsed="1"/>
+    <w:lsdException w:name="List Bullet 5" w:semiHidden="1" w:unhideWhenUsed="1"/>
+    <w:lsdException w:name="List Number 2" w:semiHidden="1" w:unhideWhenUsed="1"/>
+    <w:lsdException w:name="List Number 3" w:semiHidden="1" w:unhideWhenUsed="1"/>
+    <w:lsdException w:name="List Number 4" w:semiHidden="1" w:unhideWhenUsed="1"/>
+    <w:lsdException w:name="List Number 5" w:semiHidden="1" w:unhideWhenUsed="1"/>
+    <w:lsdException w:name="Title" w:qFormat="1" w:uiPriority="10"/>
+    <w:lsdException w:name="Closing" w:semiHidden="1" w:unhideWhenUsed="1"/>
+    <w:lsdException w:name="Signature" w:semiHidden="1" w:unhideWhenUsed="1"/>
+    <w:lsdException w:name="Default Paragraph Font" w:semiHidden="1" w:uiPriority="1" w:unhideWhenUsed="1"/>
+    <w:lsdException w:name="Body Text" w:semiHidden="1" w:unhideWhenUsed="1"/>
+    <w:lsdException w:name="Body Text Indent" w:semiHidden="1" w:unhideWhenUsed="1"/>
+    <w:lsdException w:name="List Continue" w:semiHidden="1" w:unhideWhenUsed="1"/>
+    <w:lsdException w:name="List Continue 2" w:semiHidden="1" w:unhideWhenUsed="1"/>
+    <w:lsdException w:name="List Continue 3" w:semiHidden="1" w:unhideWhenUsed="1"/>
+    <w:lsdException w:name="List Continue 4" w:semiHidden="1" w:unhideWhenUsed="1"/>
+    <w:lsdException w:name="List Continue 5" w:semiHidden="1" w:unhideWhenUsed="1"/>
+    <w:lsdException w:name="Message Header" w:semiHidden="1" w:unhideWhenUsed="1"/>
+    <w:lsdException w:name="Subtitle" w:qFormat="1" w:uiPriority="11"/>
+    <w:lsdException w:name="Salutation" w:semiHidden="1" w:unhideWhenUsed="1"/>
+    <w:lsdException w:name="Date" w:semiHidden="1" w:unhideWhenUsed="1"/>
+    <w:lsdException w:name="Body Text First Indent" w:semiHidden="1" w:unhideWhenUsed="1"/>
+    <w:lsdException w:name="Body Text First Indent 2" w:semiHidden="1" w:unhideWhenUsed="1"/>
+    <w:lsdException w:name="Note Heading" w:semiHidden="1" w:unhideWhenUsed="1"/>
+    <w:lsdException w:name="Body Text 2" w:semiHidden="1" w:unhideWhenUsed="1"/>
+    <w:lsdException w:name="Body Text 3" w:semiHidden="1" w:unhideWhenUsed="1"/>
+    <w:lsdException w:name="Body Text Indent 2" w:semiHidden="1" w:unhideWhenUsed="1"/>
+    <w:lsdException w:name="Body Text Indent 3" w:semiHidden="1" w:unhideWhenUsed="1"/>
+    <w:lsdException w:name="Block Text" w:semiHidden="1" w:unhideWhenUsed="1"/>
+    <w:lsdException w:name="Hyperlink" w:semiHidden="1" w:unhideWhenUsed="1"/>
+    <w:lsdException w:name="FollowedHyperlink" w:semiHidden="1" w:unhideWhenUsed="1"/>
+    <w:lsdException w:name="Strong" w:qFormat="1" w:uiPriority="22"/>
+    <w:lsdException w:name="Emphasis" w:qFormat="1" w:uiPriority="20"/>
+    <w:lsdException w:name="Document Map" w:semiHidden="1" w:unhideWhenUsed="1"/>
+    <w:lsdException w:name="Plain Text" w:semiHidden="1" w:unhideWhenUsed="1"/>
+    <w:lsdException w:name="E-mail Signature" w:semiHidden="1" w:unhideWhenUsed="1"/>
+    <w:lsdException w:name="HTML Top of Form" w:semiHidden="1" w:unhideWhenUsed="1"/>
+    <w:lsdException w:name="HTML Bottom of Form" w:semiHidden="1" w:unhideWhenUsed="1"/>
+    <w:lsdException w:name="Normal (Web)" w:semiHidden="1" w:unhideWhenUsed="1"/>
+    <w:lsdException w:name="HTML Acronym" w:semiHidden="1" w:unhideWhenUsed="1"/>
+    <w:lsdException w:name="HTML Address" w:semiHidden="1" w:unhideWhenUsed="1"/>
+    <w:lsdException w:name="HTML Cite" w:semiHidden="1" w:unhideWhenUsed="1"/>
+    <w:lsdException w:name="HTML Code" w:semiHidden="1" w:unhideWhenUsed="1"/>
+    <w:lsdException w:name="HTML Definition" w:semiHidden="1" w:unhideWhenUsed="1"/>
+    <w:lsdException w:name="HTML Keyboard" w:semiHidden="1" w:unhideWhenUsed="1"/>
+    <w:lsdException w:name="HTML Preformatted" w:semiHidden="1" w:unhideWhenUsed="1"/>
+    <w:lsdException w:name="HTML Sample" w:semiHidden="1" w:unhideWhenUsed="1"/>
+    <w:lsdException w:name="HTML Typewriter" w:semiHidden="1" w:unhideWhenUsed="1"/>
+    <w:lsdException w:name="HTML Variable" w:semiHidden="1" w:unhideWhenUsed="1"/>
+    <w:lsdException w:name="Normal Table" w:semiHidden="1" w:unhideWhenUsed="1"/>
+    <w:lsdException w:name="annotation subject" w:semiHidden="1" w:unhideWhenUsed="1"/>
+    <w:lsdException w:name="No List" w:semiHidden="1" w:unhideWhenUsed="1"/>
+    <w:lsdException w:name="Outline List 1" w:semiHidden="1" w:unhideWhenUsed="1"/>
+    <w:lsdException w:name="Outline List 2" w:semiHidden="1" w:unhideWhenUsed="1"/>
+    <w:lsdException w:name="Outline List 3" w:semiHidden="1" w:unhideWhenUsed="1"/>
+    <w:lsdException w:name="Table Simple 1" w:semiHidden="1" w:unhideWhenUsed="1"/>
+    <w:lsdException w:name="Table Simple 2" w:semiHidden="1" w:unhideWhenUsed="1"/>
+    <w:lsdException w:name="Table Simple 3" w:semiHidden="1" w:unhideWhenUsed="1"/>
+    <w:lsdException w:name="Table Classic 1" w:semiHidden="1" w:unhideWhenUsed="1"/>
+    <w:lsdException w:name="Table Classic 2" w:semiHidden="1" w:unhideWhenUsed="1"/>
+    <w:lsdException w:name="Table Classic 3" w:semiHidden="1" w:unhideWhenUsed="1"/>
+    <w:lsdException w:name="Table Classic 4" w:semiHidden="1" w:unhideWhenUsed="1"/>
+    <w:lsdException w:name="Table Colorful 1" w:semiHidden="1" w:unhideWhenUsed="1"/>
+    <w:lsdException w:name="Table Colorful 2" w:semiHidden="1" w:unhideWhenUsed="1"/>
+    <w:lsdException w:name="Table Colorful 3" w:semiHidden="1" w:unhideWhenUsed="1"/>
+    <w:lsdException w:name="Table Columns 1" w:semiHidden="1" w:unhideWhenUsed="1"/>
+    <w:lsdException w:name="Table Columns 2" w:semiHidden="1" w:unhideWhenUsed="1"/>
+    <w:lsdException w:name="Table Columns 3" w:semiHidden="1" w:unhideWhenUsed="1"/>
+    <w:lsdException w:name="Table Columns 4" w:semiHidden="1" w:unhideWhenUsed="1"/>
+    <w:lsdException w:name="Table Columns 5" w:semiHidden="1" w:unhideWhenUsed="1"/>
+    <w:lsdException w:name="Table Grid 1" w:semiHidden="1" w:unhideWhenUsed="1"/>
+    <w:lsdException w:name="Table Grid 2" w:semiHidden="1" w:unhideWhenUsed="1"/>
+    <w:lsdException w:name="Table Grid 3" w:semiHidden="1" w:unhideWhenUsed="1"/>
+    <w:lsdException w:name="Table Grid 4" w:semiHidden="1" w:unhideWhenUsed="1"/>
+    <w:lsdException w:name="Table Grid 5" w:semiHidden="1" w:unhideWhenUsed="1"/>
+    <w:lsdException w:name="Table Grid 6" w:semiHidden="1" w:unhideWhenUsed="1"/>
+    <w:lsdException w:name="Table Grid 7" w:semiHidden="1" w:unhideWhenUsed="1"/>
+    <w:lsdException w:name="Table Grid 8" w:semiHidden="1" w:unhideWhenUsed="1"/>
+    <w:lsdException w:name="Table List 1" w:semiHidden="1" w:unhideWhenUsed="1"/>
+    <w:lsdException w:name="Table List 2" w:semiHidden="1" w:unhideWhenUsed="1"/>
+    <w:lsdException w:name="Table List 3" w:semiHidden="1" w:unhideWhenUsed="1"/>
+    <w:lsdException w:name="Table List 4" w:semiHidden="1" w:unhideWhenUsed="1"/>
+    <w:lsdException w:name="Table List 5" w:semiHidden="1" w:unhideWhenUsed="1"/>
+    <w:lsdException w:name="Table List 6" w:semiHidden="1" w:unhideWhenUsed="1"/>
+    <w:lsdException w:name="Table List 7" w:semiHidden="1" w:unhideWhenUsed="1"/>
+    <w:lsdException w:name="Table List 8" w:semiHidden="1" w:unhideWhenUsed="1"/>
+    <w:lsdException w:name="Table 3D effects 1" w:semiHidden="1" w:unhideWhenUsed="1"/>
+    <w:lsdException w:name="Table 3D effects 2" w:semiHidden="1" w:unhideWhenUsed="1"/>
+    <w:lsdException w:name="Table 3D effects 3" w:semiHidden="1" w:unhideWhenUsed="1"/>
+    <w:lsdException w:name="Table Contemporary" w:semiHidden="1" w:unhideWhenUsed="1"/>
+    <w:lsdException w:name="Table Elegant" w:semiHidden="1" w:unhideWhenUsed="1"/>
+    <w:lsdException w:name="Table Professional" w:semiHidden="1" w:unhideWhenUsed="1"/>
+    <w:lsdException w:name="Table Subtle 1" w:semiHidden="1" w:unhideWhenUsed="1"/>
+    <w:lsdException w:name="Table Subtle 2" w:semiHidden="1" w:unhideWhenUsed="1"/>
+    <w:lsdException w:name="Table Web 1" w:semiHidden="1" w:unhideWhenUsed="1"/>
+    <w:lsdException w:name="Table Web 2" w:semiHidden="1" w:unhideWhenUsed="1"/>
+    <w:lsdException w:name="Table Web 3" w:semiHidden="1" w:unhideWhenUsed="1"/>
+    <w:lsdException w:name="Balloon Text" w:semiHidden="1" w:unhideWhenUsed="1"/>
+    <w:lsdException w:name="Table Grid" w:uiPriority="39"/>
+    <w:lsdException w:name="Table Theme" w:semiHidden="1" w:unhideWhenUsed="1"/>
+    <w:lsdException w:name="Placeholder Text" w:semiHidden="1"/>
+    <w:lsdException w:name="No Spacing" w:qFormat="1" w:uiPriority="1"/>
+    <w:lsdException w:name="Light Shading" w:uiPriority="60"/>
+    <w:lsdException w:name="Light List" w:uiPriority="61"/>
+    <w:lsdException w:name="Light Grid" w:uiPriority="62"/>
+    <w:lsdException w:name="Medium Shading 1" w:uiPriority="63"/>
+    <w:lsdException w:name="Medium Shading 2" w:uiPriority="64"/>
+    <w:lsdException w:name="Medium List 1" w:uiPriority="65"/>
+    <w:lsdException w:name="Medium List 2" w:uiPriority="66"/>
+    <w:lsdException w:name="Medium Grid 1" w:uiPriority="67"/>
+    <w:lsdException w:name="Medium Grid 2" w:uiPriority="68"/>
+    <w:lsdException w:name="Medium Grid 3" w:uiPriority="69"/>
+    <w:lsdException w:name="Dark List" w:uiPriority="70"/>
+    <w:lsdException w:name="Colorful Shading" w:uiPriority="71"/>
+    <w:lsdException w:name="Colorful List" w:uiPriority="72"/>
+    <w:lsdException w:name="Colorful Grid" w:uiPriority="73"/>
+    <w:lsdException w:name="Light Shading Accent 1" w:uiPriority="60"/>
+    <w:lsdException w:name="Light List Accent 1" w:uiPriority="61"/>
+    <w:lsdException w:name="Light Grid Accent 1" w:uiPriority="62"/>
+    <w:lsdException w:name="Medium Shading 1 Accent 1" w:uiPriority="63"/>
+    <w:lsdException w:name="Medium Shading 2 Accent 1" w:uiPriority="64"/>
+    <w:lsdException w:name="Medium List 1 Accent 1" w:uiPriority="65"/>
+    <w:lsdException w:name="Revision" w:semiHidden="1"/>
+    <w:lsdException w:name="List Paragraph" w:qFormat="1" w:uiPriority="34"/>
+    <w:lsdException w:name="Quote" w:qFormat="1" w:uiPriority="29"/>
+    <w:lsdException w:name="Intense Quote" w:qFormat="1" w:uiPriority="30"/>
+    <w:lsdException w:name="Medium List 2 Accent 1" w:uiPriority="66"/>
+    <w:lsdException w:name="Medium Grid 1 Accent 1" w:uiPriority="67"/>
+    <w:lsdException w:name="Medium Grid 2 Accent 1" w:uiPriority="68"/>
+    <w:lsdException w:name="Medium Grid 3 Accent 1" w:uiPriority="69"/>
+    <w:lsdException w:name="Dark List Accent 1" w:uiPriority="70"/>
+    <w:lsdException w:name="Colorful Shading Accent 1" w:uiPriority="71"/>
+    <w:lsdException w:name="Colorful List Accent 1" w:uiPriority="72"/>
+    <w:lsdException w:name="Colorful Grid Accent 1" w:uiPriority="73"/>
+    <w:lsdException w:name="Light Shading Accent 2" w:uiPriority="60"/>
+    <w:lsdException w:name="Light List Accent 2" w:uiPriority="61"/>
+    <w:lsdException w:name="Light Grid Accent 2" w:uiPriority="62"/>
+    <w:lsdException w:name="Medium Shading 1 Accent 2" w:uiPriority="63"/>
+    <w:lsdException w:name="Medium Shading 2 Accent 2" w:uiPriority="64"/>
+    <w:lsdException w:name="Medium List 1 Accent 2" w:uiPriority="65"/>
+    <w:lsdException w:name="Medium List 2 Accent 2" w:uiPriority="66"/>
+    <w:lsdException w:name="Medium Grid 1 Accent 2" w:uiPriority="67"/>
+    <w:lsdException w:name="Medium Grid 2 Accent 2" w:uiPriority="68"/>
+    <w:lsdException w:name="Medium Grid 3 Accent 2" w:uiPriority="69"/>
+    <w:lsdException w:name="Dark List Accent 2" w:uiPriority="70"/>
+    <w:lsdException w:name="Colorful Shading Accent 2" w:uiPriority="71"/>
+    <w:lsdException w:name="Colorful List Accent 2" w:uiPriority="72"/>
+    <w:lsdException w:name="Colorful Grid Accent 2" w:uiPriority="73"/>
+    <w:lsdException w:name="Light Shading Accent 3" w:uiPriority="60"/>
+    <w:lsdException w:name="Light List Accent 3" w:uiPriority="61"/>
+    <w:lsdException w:name="Light Grid Accent 3" w:uiPriority="62"/>
+    <w:lsdException w:name="Medium Shading 1 Accent 3" w:uiPriority="63"/>
+    <w:lsdException w:name="Medium Shading 2 Accent 3" w:uiPriority="64"/>
+    <w:lsdException w:name="Medium List 1 Accent 3" w:uiPriority="65"/>
+    <w:lsdException w:name="Medium List 2 Accent 3" w:uiPriority="66"/>
+    <w:lsdException w:name="Medium Grid 1 Accent 3" w:uiPriority="67"/>
+    <w:lsdException w:name="Medium Grid 2 Accent 3" w:uiPriority="68"/>
+    <w:lsdException w:name="Medium Grid 3 Accent 3" w:uiPriority="69"/>
+    <w:lsdException w:name="Dark List Accent 3" w:uiPriority="70"/>
+    <w:lsdException w:name="Colorful Shading Accent 3" w:uiPriority="71"/>
+    <w:lsdException w:name="Colorful List Accent 3" w:uiPriority="72"/>
+    <w:lsdException w:name="Colorful Grid Accent 3" w:uiPriority="73"/>
+    <w:lsdException w:name="Light Shading Accent 4" w:uiPriority="60"/>
+    <w:lsdException w:name="Light List Accent 4" w:uiPriority="61"/>
+    <w:lsdException w:name="Light Grid Accent 4" w:uiPriority="62"/>
+    <w:lsdException w:name="Medium Shading 1 Accent 4" w:uiPriority="63"/>
+    <w:lsdException w:name="Medium Shading 2 Accent 4" w:uiPriority="64"/>
+    <w:lsdException w:name="Medium List 1 Accent 4" w:uiPriority="65"/>
+    <w:lsdException w:name="Medium List 2 Accent 4" w:uiPriority="66"/>
+    <w:lsdException w:name="Medium Grid 1 Accent 4" w:uiPriority="67"/>
+    <w:lsdException w:name="Medium Grid 2 Accent 4" w:uiPriority="68"/>
+    <w:lsdException w:name="Medium Grid 3 Accent 4" w:uiPriority="69"/>
+    <w:lsdException w:name="Dark List Accent 4" w:uiPriority="70"/>
+    <w:lsdException w:name="Colorful Shading Accent 4" w:uiPriority="71"/>
+    <w:lsdException w:name="Colorful List Accent 4" w:uiPriority="72"/>
+    <w:lsdException w:name="Colorful Grid Accent 4" w:uiPriority="73"/>
+    <w:lsdException w:name="Light Shading Accent 5" w:uiPriority="60"/>
+    <w:lsdException w:name="Light List Accent 5" w:uiPriority="61"/>
+    <w:lsdException w:name="Light Grid Accent 5" w:uiPriority="62"/>
+    <w:lsdException w:name="Medium Shading 1 Accent 5" w:uiPriority="63"/>
+    <w:lsdException w:name="Medium Shading 2 Accent 5" w:uiPriority="64"/>
+    <w:lsdException w:name="Medium List 1 Accent 5" w:uiPriority="65"/>
+    <w:lsdException w:name="Medium List 2 Accent 5" w:uiPriority="66"/>
+    <w:lsdException w:name="Medium Grid 1 Accent 5" w:uiPriority="67"/>
+    <w:lsdException w:name="Medium Grid 2 Accent 5" w:uiPriority="68"/>
+    <w:lsdException w:name="Medium Grid 3 Accent 5" w:uiPriority="69"/>
+    <w:lsdException w:name="Dark List Accent 5" w:uiPriority="70"/>
+    <w:lsdException w:name="Colorful Shading Accent 5" w:uiPriority="71"/>
+    <w:lsdException w:name="Colorful List Accent 5" w:uiPriority="72"/>
+    <w:lsdException w:name="Colorful Grid Accent 5" w:uiPriority="73"/>
+    <w:lsdException w:name="Light Shading Accent 6" w:uiPriority="60"/>
+    <w:lsdException w:name="Light List Accent 6" w:uiPriority="61"/>
+    <w:lsdException w:name="Light Grid Accent 6" w:uiPriority="62"/>
+    <w:lsdException w:name="Medium Shading 1 Accent 6" w:uiPriority="63"/>
+    <w:lsdException w:name="Medium Shading 2 Accent 6" w:uiPriority="64"/>
+    <w:lsdException w:name="Medium List 1 Accent 6" w:uiPriority="65"/>
+    <w:lsdException w:name="Medium List 2 Accent 6" w:uiPriority="66"/>
+    <w:lsdException w:name="Medium Grid 1 Accent 6" w:uiPriority="67"/>
+    <w:lsdException w:name="Medium Grid 2 Accent 6" w:uiPriority="68"/>
+    <w:lsdException w:name="Medium Grid 3 Accent 6" w:uiPriority="69"/>
+    <w:lsdException w:name="Dark List Accent 6" w:uiPriority="70"/>
+    <w:lsdException w:name="Colorful Shading Accent 6" w:uiPriority="71"/>
+    <w:lsdException w:name="Colorful List Accent 6" w:uiPriority="72"/>
+    <w:lsdException w:name="Colorful Grid Accent 6" w:uiPriority="73"/>
+    <w:lsdException w:name="Subtle Emphasis" w:qFormat="1" w:uiPriority="19"/>
+    <w:lsdException w:name="Intense Emphasis" w:qFormat="1" w:uiPriority="21"/>
+    <w:lsdException w:name="Subtle Reference" w:qFormat="1" w:uiPriority="31"/>
+    <w:lsdException w:name="Intense Reference" w:qFormat="1" w:uiPriority="32"/>
+    <w:lsdException w:name="Book Title" w:qFormat="1" w:uiPriority="33"/>
+    <w:lsdException w:name="Bibliography" w:semiHidden="1" w:uiPriority="37" w:unhideWhenUsed="1"/>
+    <w:lsdException w:name="TOC Heading" w:qFormat="1" w:semiHidden="1" w:uiPriority="39" w:unhideWhenUsed="1"/>
+    <w:lsdException w:name="Plain Table 1" w:uiPriority="41"/>
+    <w:lsdException w:name="Plain Table 2" w:uiPriority="42"/>
+    <w:lsdException w:name="Plain Table 3" w:uiPriority="43"/>
+    <w:lsdException w:name="Plain Table 4" w:uiPriority="44"/>
+    <w:lsdException w:name="Plain Table 5" w:uiPriority="45"/>
+    <w:lsdException w:name="Grid Table Light" w:uiPriority="40"/>
+    <w:lsdException w:name="Grid Table 1 Light" w:uiPriority="46"/>
+    <w:lsdException w:name="Grid Table 2" w:uiPriority="47"/>
+    <w:lsdException w:name="Grid Table 3" w:uiPriority="48"/>
+    <w:lsdException w:name="Grid Table 4" w:uiPriority="49"/>
+    <w:lsdException w:name="Grid Table 5 Dark" w:uiPriority="50"/>
+    <w:lsdException w:name="Grid Table 6 Colorful" w:uiPriority="51"/>
+    <w:lsdException w:name="Grid Table 7 Colorful" w:uiPriority="52"/>
+    <w:lsdException w:name="Grid Table 1 Light Accent 1" w:uiPriority="46"/>
+    <w:lsdException w:name="Grid Table 2 Accent 1" w:uiPriority="47"/>
+    <w:lsdException w:name="Grid Table 3 Accent 1" w:uiPriority="48"/>
+    <w:lsdException w:name="Grid Table 4 Accent 1" w:uiPriority="49"/>
+    <w:lsdException w:name="Grid Table 5 Dark Accent 1" w:uiPriority="50"/>
+    <w:lsdException w:name="Grid Table 6 Colorful Accent 1" w:uiPriority="51"/>
+    <w:lsdException w:name="Grid Table 7 Colorful Accent 1" w:uiPriority="52"/>
+    <w:lsdException w:name="Grid Table 1 Light Accent 2" w:uiPriority="46"/>
+    <w:lsdException w:name="Grid Table 2 Accent 2" w:uiPriority="47"/>
+    <w:lsdException w:name="Grid Table 3 Accent 2" w:uiPriority="48"/>
+    <w:lsdException w:name="Grid Table 4 Accent 2" w:uiPriority="49"/>
+    <w:lsdException w:name="Grid Table 5 Dark Accent 2" w:uiPriority="50"/>
+    <w:lsdException w:name="Grid Table 6 Colorful Accent 2" w:uiPriority="51"/>
+    <w:lsdException w:name="Grid Table 7 Colorful Accent 2" w:uiPriority="52"/>
+    <w:lsdException w:name="Grid Table 1 Light Accent 3" w:uiPriority="46"/>
+    <w:lsdException w:name="Grid Table 2 Accent 3" w:uiPriority="47"/>
+    <w:lsdException w:name="Grid Table 3 Accent 3" w:uiPriority="48"/>
+    <w:lsdException w:name="Grid Table 4 Accent 3" w:uiPriority="49"/>
+    <w:lsdException w:name="Grid Table 5 Dark Accent 3" w:uiPriority="50"/>
+    <w:lsdException w:name="Grid Table 6 Colorful Accent 3" w:uiPriority="51"/>
+    <w:lsdException w:name="Grid Table 7 Colorful Accent 3" w:uiPriority="52"/>
+    <w:lsdException w:name="Grid Table 1 Light Accent 4" w:uiPriority="46"/>
+    <w:lsdException w:name="Grid Table 2 Accent 4" w:uiPriority="47"/>
+    <w:lsdException w:name="Grid Table 3 Accent 4" w:uiPriority="48"/>
+    <w:lsdException w:name="Grid Table 4 Accent 4" w:uiPriority="49"/>
+    <w:lsdException w:name="Grid Table 5 Dark Accent 4" w:uiPriority="50"/>
+    <w:lsdException w:name="Grid Table 6 Colorful Accent 4" w:uiPriority="51"/>
+    <w:lsdException w:name="Grid Table 7 Colorful Accent 4" w:uiPriority="52"/>
+    <w:lsdException w:name="Grid Table 1 Light Accent 5" w:uiPriority="46"/>
+    <w:lsdException w:name="Grid Table 2 Accent 5" w:uiPriority="47"/>
+    <w:lsdException w:name="Grid Table 3 Accent 5" w:uiPriority="48"/>
+    <w:lsdException w:name="Grid Table 4 Accent 5" w:uiPriority="49"/>
+    <w:lsdException w:name="Grid Table 5 Dark Accent 5" w:uiPriority="50"/>
+    <w:lsdException w:name="Grid Table 6 Colorful Accent 5" w:uiPriority="51"/>
+    <w:lsdException w:name="Grid Table 7 Colorful Accent 5" w:uiPriority="52"/>
+    <w:lsdException w:name="Grid Table 1 Light Accent 6" w:uiPriority="46"/>
+    <w:lsdException w:name="Grid Table 2 Accent 6" w:uiPriority="47"/>
+    <w:lsdException w:name="Grid Table 3 Accent 6" w:uiPriority="48"/>
+    <w:lsdException w:name="Grid Table 4 Accent 6" w:uiPriority="49"/>
+    <w:lsdException w:name="Grid Table 5 Dark Accent 6" w:uiPriority="50"/>
+    <w:lsdException w:name="Grid Table 6 Colorful Accent 6" w:uiPriority="51"/>
+    <w:lsdException w:name="Grid Table 7 Colorful Accent 6" w:uiPriority="52"/>
+    <w:lsdException w:name="List Table 1 Light" w:uiPriority="46"/>
+    <w:lsdException w:name="List Table 2" w:uiPriority="47"/>
+    <w:lsdException w:name="List Table 3" w:uiPriority="48"/>
+    <w:lsdException w:name="List Table 4" w:uiPriority="49"/>
+    <w:lsdException w:name="List Table 5 Dark" w:uiPriority="50"/>
+    <w:lsdException w:name="List Table 6 Colorful" w:uiPriority="51"/>
+    <w:lsdException w:name="List Table 7 Colorful" w:uiPriority="52"/>
+    <w:lsdException w:name="List Table 1 Light Accent 1" w:uiPriority="46"/>
+    <w:lsdException w:name="List Table 2 Accent 1" w:uiPriority="47"/>
+    <w:lsdException w:name="List Table 3 Accent 1" w:uiPriority="48"/>
+    <w:lsdException w:name="List Table 4 Accent 1" w:uiPriority="49"/>
+    <w:lsdException w:name="List Table 5 Dark Accent 1" w:uiPriority="50"/>
+    <w:lsdException w:name="List Table 6 Colorful Accent 1" w:uiPriority="51"/>
+    <w:lsdException w:name="List Table 7 Colorful Accent 1" w:uiPriority="52"/>
+    <w:lsdException w:name="List Table 1 Light Accent 2" w:uiPriority="46"/>
+    <w:lsdException w:name="List Table 2 Accent 2" w:uiPriority="47"/>
+    <w:lsdException w:name="List Table 3 Accent 2" w:uiPriority="48"/>
+    <w:lsdException w:name="List Table 4 Accent 2" w:uiPriority="49"/>
+    <w:lsdException w:name="List Table 5 Dark Accent 2" w:uiPriority="50"/>
+    <w:lsdException w:name="List Table 6 Colorful Accent 2" w:uiPriority="51"/>
+    <w:lsdException w:name="List Table 7 Colorful Accent 2" w:uiPriority="52"/>
+    <w:lsdException w:name="List Table 1 Light Accent 3" w:uiPriority="46"/>
+    <w:lsdException w:name="List Table 2 Accent 3" w:uiPriority="47"/>
+    <w:lsdException w:name="List Table 3 Accent 3" w:uiPriority="48"/>
+    <w:lsdException w:name="List Table 4 Accent 3" w:uiPriority="49"/>
+    <w:lsdException w:name="List Table 5 Dark Accent 3" w:uiPriority="50"/>
+    <w:lsdException w:name="List Table 6 Colorful Accent 3" w:uiPriority="51"/>
+    <w:lsdException w:name="List Table 7 Colorful Accent 3" w:uiPriority="52"/>
+    <w:lsdException w:name="List Table 1 Light Accent 4" w:uiPriority="46"/>
+    <w:lsdException w:name="List Table 2 Accent 4" w:uiPriority="47"/>
+    <w:lsdException w:name="List Table 3 Accent 4" w:uiPriority="48"/>
+    <w:lsdException w:name="List Table 4 Accent 4" w:uiPriority="49"/>
+    <w:lsdException w:name="List Table 5 Dark Accent 4" w:uiPriority="50"/>
+    <w:lsdException w:name="List Table 6 Colorful Accent 4" w:uiPriority="51"/>
+    <w:lsdException w:name="List Table 7 Colorful Accent 4" w:uiPriority="52"/>
+    <w:lsdException w:name="List Table 1 Light Accent 5" w:uiPriority="46"/>
+    <w:lsdException w:name="List Table 2 Accent 5" w:uiPriority="47"/>
+    <w:lsdException w:name="List Table 3 Accent 5" w:uiPriority="48"/>
+    <w:lsdException w:name="List Table 4 Accent 5" w:uiPriority="49"/>
+    <w:lsdException w:name="List Table 5 Dark Accent 5" w:uiPriority="50"/>
+    <w:lsdException w:name="List Table 6 Colorful Accent 5" w:uiPriority="51"/>
+    <w:lsdException w:name="List Table 7 Colorful Accent 5" w:uiPriority="52"/>
+    <w:lsdException w:name="List Table 1 Light Accent 6" w:uiPriority="46"/>
+    <w:lsdException w:name="List Table 2 Accent 6" w:uiPriority="47"/>
+    <w:lsdException w:name="List Table 3 Accent 6" w:uiPriority="48"/>
+    <w:lsdException w:name="List Table 4 Accent 6" w:uiPriority="49"/>
+    <w:lsdException w:name="List Table 5 Dark Accent 6" w:uiPriority="50"/>
+    <w:lsdException w:name="List Table 6 Colorful Accent 6" w:uiPriority="51"/>
+    <w:lsdException w:name="List Table 7 Colorful Accent 6" w:uiPriority="52"/>
+    <w:lsdException w:name="Mention" w:semiHidden="1" w:unhideWhenUsed="1"/>
+    <w:lsdException w:name="Smart Hyperlink" w:semiHidden="1" w:unhideWhenUsed="1"/>
+    <w:lsdException w:name="Hashtag" w:semiHidden="1" w:unhideWhenUsed="1"/>
+    <w:lsdException w:name="Unresolved Mention" w:semiHidden="1" w:unhideWhenUsed="1"/>
+    <w:lsdException w:name="Smart Link" w:semiHidden="1" w:unhideWhenUsed="1"/>
+  </w:latentStyles>
+  <w:style w:default="1" w:styleId="Normal" w:type="paragraph">
+    <w:name w:val="Normal"/>
+    <w:qFormat/>
+    <w:pPr>
+      <w:spacing w:after="160" w:line="276" w:lineRule="auto"/>
+    </w:pPr>
+  </w:style>
+  <w:style w:styleId="Heading1" w:type="paragraph">
+    <w:name w:val="heading 1"/>
+    <w:basedOn w:val="Normal"/>
+    <w:next w:val="Normal"/>
+    <w:uiPriority w:val="9"/>
+    <w:qFormat/>
+    <w:pPr>
+      <w:pBdr>
+        <w:bottom w:color="1E90FF" w:space="4" w:sz="6" w:val="single"/>
+      </w:pBdr>
+      <w:spacing w:after="240" w:before="480"/>
+      <w:outlineLvl w:val="0"/>
+    </w:pPr>
+    <w:rPr>
+      <w:b/>
+      <w:bCs/>
+      <w:color w:val="0A3D62"/>
+      <w:sz w:val="44"/>
+      <w:szCs w:val="44"/>
+    </w:rPr>
+  </w:style>
+  <w:style w:styleId="Heading2" w:type="paragraph">
+    <w:name w:val="heading 2"/>
+    <w:basedOn w:val="Normal"/>
+    <w:next w:val="Normal"/>
+    <w:uiPriority w:val="9"/>
+    <w:unhideWhenUsed/>
+    <w:qFormat/>
+    <w:pPr>
+      <w:pBdr>
+        <w:bottom w:color="E8F4FD" w:space="2" w:sz="3" w:val="single"/>
+      </w:pBdr>
+      <w:spacing w:before="320"/>
+      <w:outlineLvl w:val="1"/>
+    </w:pPr>
+    <w:rPr>
+      <w:b/>
+      <w:bCs/>
+      <w:color w:val="0A3D62"/>
+      <w:sz w:val="32"/>
+      <w:szCs w:val="32"/>
+    </w:rPr>
+  </w:style>
+  <w:style w:styleId="Heading3" w:type="paragraph">
+    <w:name w:val="heading 3"/>
+    <w:basedOn w:val="Normal"/>
+    <w:next w:val="Normal"/>
+    <w:uiPriority w:val="9"/>
+    <w:unhideWhenUsed/>
+    <w:qFormat/>
+    <w:pPr>
+      <w:spacing w:after="120" w:before="240"/>
+      <w:outlineLvl w:val="2"/>
+    </w:pPr>
+    <w:rPr>
+      <w:b/>
+      <w:bCs/>
+      <w:color w:val="0C7ABA"/>
+      <w:sz w:val="26"/>
+      <w:szCs w:val="26"/>
+    </w:rPr>
+  </w:style>
+  <w:style w:styleId="Heading4" w:type="paragraph">
+    <w:name w:val="heading 4"/>
+    <w:basedOn w:val="Normal"/>
+    <w:next w:val="Normal"/>
+    <w:uiPriority w:val="9"/>
+    <w:unhideWhenUsed/>
+    <w:qFormat/>
+    <w:pPr>
+      <w:spacing w:after="80" w:before="160"/>
+      <w:outlineLvl w:val="3"/>
+    </w:pPr>
+    <w:rPr>
+      <w:b/>
+      <w:bCs/>
+      <w:i/>
+      <w:iCs/>
+      <w:color w:val="0C7ABA"/>
+      <w:sz w:val="24"/>
+      <w:szCs w:val="24"/>
+    </w:rPr>
+  </w:style>
+  <w:style w:styleId="Heading5" w:type="paragraph">
+    <w:name w:val="heading 5"/>
+    <w:basedOn w:val="Normal"/>
+    <w:next w:val="Normal"/>
+    <w:uiPriority w:val="9"/>
+    <w:semiHidden/>
+    <w:unhideWhenUsed/>
+    <w:qFormat/>
+    <w:pPr>
+      <w:outlineLvl w:val="4"/>
+    </w:pPr>
+    <w:rPr>
+      <w:color w:val="2E74B5"/>
+    </w:rPr>
+  </w:style>
+  <w:style w:styleId="Heading6" w:type="paragraph">
+    <w:name w:val="heading 6"/>
+    <w:basedOn w:val="Normal"/>
+    <w:next w:val="Normal"/>
+    <w:uiPriority w:val="9"/>
+    <w:semiHidden/>
+    <w:unhideWhenUsed/>
+    <w:qFormat/>
+    <w:pPr>
+      <w:outlineLvl w:val="5"/>
+    </w:pPr>
+    <w:rPr>
+      <w:color w:val="1F4D78"/>
+    </w:rPr>
+  </w:style>
+  <w:style w:default="1" w:styleId="DefaultParagraphFont" w:type="character">
+    <w:name w:val="Default Paragraph Font"/>
+    <w:uiPriority w:val="1"/>
+    <w:semiHidden/>
+    <w:unhideWhenUsed/>
+  </w:style>
+  <w:style w:default="1" w:styleId="TableNormal" w:type="table">
+    <w:name w:val="Normal Table"/>
+    <w:uiPriority w:val="99"/>
+    <w:semiHidden/>
+    <w:unhideWhenUsed/>
+    <w:tblPr>
+      <w:tblInd w:type="dxa" w:w="0"/>
+      <w:tblCellMar>
+        <w:top w:type="dxa" w:w="0"/>
+        <w:left w:type="dxa" w:w="108"/>
+        <w:bottom w:type="dxa" w:w="0"/>
+        <w:right w:type="dxa" w:w="108"/>
+      </w:tblCellMar>
+    </w:tblPr>
+  </w:style>
+  <w:style w:default="1" w:styleId="NoList" w:type="numbering">
+    <w:name w:val="No List"/>
+    <w:uiPriority w:val="99"/>
+    <w:semiHidden/>
+    <w:unhideWhenUsed/>
+  </w:style>
   <w:style w:styleId="Title" w:type="paragraph">
     <w:name w:val="Title"/>
     <w:basedOn w:val="Normal"/>
     <w:next w:val="Normal"/>
+    <w:uiPriority w:val="10"/>
     <w:qFormat/>
     <w:rPr>
       <w:sz w:val="56"/>
       <w:szCs w:val="56"/>
     </w:rPr>
   </w:style>
-  <w:style w:styleId="Heading1" w:type="paragraph">
-    <w:name w:val="Heading 1"/>
-    <w:basedOn w:val="Normal"/>
-    <w:next w:val="Normal"/>
-    <w:qFormat/>
-    <w:rPr>
-      <w:color w:val="2E74B5"/>
-      <w:sz w:val="32"/>
-      <w:szCs w:val="32"/>
-    </w:rPr>
-  </w:style>
-  <w:style w:styleId="Heading2" w:type="paragraph">
-    <w:name w:val="Heading 2"/>
-    <w:basedOn w:val="Normal"/>
-    <w:next w:val="Normal"/>
-    <w:qFormat/>
-    <w:rPr>
-      <w:color w:val="2E74B5"/>
-      <w:sz w:val="26"/>
-      <w:szCs w:val="26"/>
-    </w:rPr>
-  </w:style>
-  <w:style w:styleId="Heading3" w:type="paragraph">
-    <w:name w:val="Heading 3"/>
-    <w:basedOn w:val="Normal"/>
-    <w:next w:val="Normal"/>
-    <w:qFormat/>
-    <w:rPr>
-      <w:color w:val="1F4D78"/>
-      <w:sz w:val="24"/>
-      <w:szCs w:val="24"/>
-    </w:rPr>
-  </w:style>
-  <w:style w:styleId="Heading4" w:type="paragraph">
-    <w:name w:val="Heading 4"/>
-    <w:basedOn w:val="Normal"/>
-    <w:next w:val="Normal"/>
-    <w:qFormat/>
-    <w:rPr>
-      <w:i/>
-      <w:iCs/>
-      <w:color w:val="2E74B5"/>
-    </w:rPr>
-  </w:style>
-  <w:style w:styleId="Heading5" w:type="paragraph">
-    <w:name w:val="Heading 5"/>
-    <w:basedOn w:val="Normal"/>
-    <w:next w:val="Normal"/>
-    <w:qFormat/>
-    <w:rPr>
-      <w:color w:val="2E74B5"/>
-    </w:rPr>
-  </w:style>
-  <w:style w:styleId="Heading6" w:type="paragraph">
-    <w:name w:val="Heading 6"/>
-    <w:basedOn w:val="Normal"/>
-    <w:next w:val="Normal"/>
-    <w:qFormat/>
-    <w:rPr>
-      <w:color w:val="1F4D78"/>
-    </w:rPr>
-  </w:style>
-  <w:style w:styleId="Strong" w:type="paragraph">
-    <w:name w:val="Strong"/>
+  <w:style w:customStyle="1" w:styleId="Strong1" w:type="paragraph">
+    <w:name w:val="Strong1"/>
     <w:basedOn w:val="Normal"/>
     <w:next w:val="Normal"/>
     <w:qFormat/>
@@ -761,7 +1270,6 @@
   </w:style>
   <w:style w:styleId="Hyperlink" w:type="character">
     <w:name w:val="Hyperlink"/>
-    <w:basedOn w:val="DefaultParagraphFont"/>
     <w:uiPriority w:val="99"/>
     <w:unhideWhenUsed/>
     <w:rPr>
@@ -771,7 +1279,6 @@
   </w:style>
   <w:style w:styleId="FootnoteReference" w:type="character">
     <w:name w:val="footnote reference"/>
-    <w:basedOn w:val="DefaultParagraphFont"/>
     <w:uiPriority w:val="99"/>
     <w:semiHidden/>
     <w:unhideWhenUsed/>
@@ -794,9 +1301,8 @@
       <w:szCs w:val="20"/>
     </w:rPr>
   </w:style>
-  <w:style w:styleId="FootnoteTextChar" w:type="character">
+  <w:style w:customStyle="1" w:styleId="FootnoteTextChar" w:type="character">
     <w:name w:val="Footnote Text Char"/>
-    <w:basedOn w:val="DefaultParagraphFont"/>
     <w:link w:val="FootnoteText"/>
     <w:uiPriority w:val="99"/>
     <w:semiHidden/>
@@ -808,7 +1314,6 @@
   </w:style>
   <w:style w:styleId="EndnoteReference" w:type="character">
     <w:name w:val="endnote reference"/>
-    <w:basedOn w:val="DefaultParagraphFont"/>
     <w:uiPriority w:val="99"/>
     <w:semiHidden/>
     <w:unhideWhenUsed/>
@@ -831,9 +1336,8 @@
       <w:szCs w:val="20"/>
     </w:rPr>
   </w:style>
-  <w:style w:styleId="EndnoteTextChar" w:type="character">
+  <w:style w:customStyle="1" w:styleId="EndnoteTextChar" w:type="character">
     <w:name w:val="Endnote Text Char"/>
-    <w:basedOn w:val="DefaultParagraphFont"/>
     <w:link w:val="EndnoteText"/>
     <w:uiPriority w:val="99"/>
     <w:semiHidden/>
@@ -843,115 +1347,264 @@
       <w:szCs w:val="20"/>
     </w:rPr>
   </w:style>
-  <w:style w:styleId="Heading1" w:type="paragraph">
-    <w:name w:val="Heading 1"/>
-    <w:basedOn w:val="Normal"/>
-    <w:next w:val="Normal"/>
-    <w:qFormat/>
-    <w:pPr>
-      <w:pBdr>
-        <w:bottom w:color="1e90ff" w:space="4" w:sz="6" w:val="single"/>
-      </w:pBdr>
-      <w:spacing w:after="240" w:before="480"/>
-      <w:outlineLvl w:val="0"/>
-    </w:pPr>
-    <w:rPr>
-      <w:rFonts w:ascii="Calibri" w:cs="Calibri" w:eastAsia="Calibri" w:hAnsi="Calibri"/>
-      <w:b/>
-      <w:bCs/>
-      <w:color w:val="0a3d62"/>
-      <w:sz w:val="44"/>
-      <w:szCs w:val="44"/>
-    </w:rPr>
-  </w:style>
-  <w:style w:styleId="Heading2" w:type="paragraph">
-    <w:name w:val="Heading 2"/>
-    <w:basedOn w:val="Normal"/>
-    <w:next w:val="Normal"/>
-    <w:qFormat/>
-    <w:pPr>
-      <w:pBdr>
-        <w:bottom w:color="e8f4fd" w:space="2" w:sz="3" w:val="single"/>
-      </w:pBdr>
-      <w:spacing w:after="160" w:before="320"/>
-      <w:outlineLvl w:val="1"/>
-    </w:pPr>
-    <w:rPr>
-      <w:rFonts w:ascii="Calibri" w:cs="Calibri" w:eastAsia="Calibri" w:hAnsi="Calibri"/>
-      <w:b/>
-      <w:bCs/>
-      <w:color w:val="0a3d62"/>
-      <w:sz w:val="32"/>
-      <w:szCs w:val="32"/>
-    </w:rPr>
-  </w:style>
-  <w:style w:styleId="Heading3" w:type="paragraph">
-    <w:name w:val="Heading 3"/>
-    <w:basedOn w:val="Normal"/>
-    <w:next w:val="Normal"/>
-    <w:qFormat/>
-    <w:pPr>
-      <w:spacing w:after="120" w:before="240"/>
-      <w:outlineLvl w:val="2"/>
-    </w:pPr>
-    <w:rPr>
-      <w:rFonts w:ascii="Calibri" w:cs="Calibri" w:eastAsia="Calibri" w:hAnsi="Calibri"/>
-      <w:b/>
-      <w:bCs/>
-      <w:color w:val="0c7aba"/>
-      <w:sz w:val="26"/>
-      <w:szCs w:val="26"/>
-    </w:rPr>
-  </w:style>
-  <w:style w:styleId="Heading4" w:type="paragraph">
-    <w:name w:val="Heading 4"/>
-    <w:basedOn w:val="Normal"/>
-    <w:next w:val="Normal"/>
-    <w:qFormat/>
-    <w:pPr>
-      <w:spacing w:after="80" w:before="160"/>
-      <w:outlineLvl w:val="3"/>
-    </w:pPr>
-    <w:rPr>
-      <w:rFonts w:ascii="Calibri" w:cs="Calibri" w:eastAsia="Calibri" w:hAnsi="Calibri"/>
-      <w:b/>
-      <w:bCs/>
-      <w:i/>
-      <w:iCs/>
-      <w:color w:val="0c7aba"/>
-      <w:sz w:val="24"/>
-      <w:szCs w:val="24"/>
-    </w:rPr>
-  </w:style>
-  <w:style w:styleId="Normal" w:type="paragraph">
-    <w:name w:val="Normal"/>
-    <w:pPr>
-      <w:spacing w:after="160" w:line="276"/>
-    </w:pPr>
-    <w:rPr>
-      <w:rFonts w:ascii="Calibri" w:cs="Calibri" w:eastAsia="Calibri" w:hAnsi="Calibri"/>
-      <w:color w:val="1a1a1a"/>
-      <w:sz w:val="22"/>
-      <w:szCs w:val="22"/>
-    </w:rPr>
-  </w:style>
-  <w:style w:styleId="verbatim" w:type="paragraph">
+  <w:style w:customStyle="1" w:styleId="verbatim" w:type="paragraph">
     <w:name w:val="verbatim"/>
     <w:basedOn w:val="Normal"/>
     <w:pPr>
       <w:pBdr>
-        <w:left w:color="1e90ff" w:space="6" w:sz="12" w:val="single"/>
+        <w:left w:color="1E90FF" w:space="6" w:sz="12" w:val="single"/>
       </w:pBdr>
-      <w:shd w:fill="e8f4fd" w:val="clear"/>
+      <w:shd w:color="auto" w:fill="E8F4FD" w:val="clear"/>
       <w:spacing w:after="120" w:before="120"/>
       <w:ind w:left="360"/>
     </w:pPr>
     <w:rPr>
       <w:rFonts w:ascii="Courier New" w:cs="Courier New" w:eastAsia="Courier New" w:hAnsi="Courier New"/>
-      <w:color w:val="0a3d62"/>
+      <w:color w:val="0A3D62"/>
       <w:sz w:val="18"/>
       <w:szCs w:val="18"/>
     </w:rPr>
+  </w:style>
+  <w:style w:styleId="GridTable5Dark-Accent5" w:type="table">
+    <w:name w:val="Grid Table 5 Dark Accent 5"/>
+    <w:basedOn w:val="TableNormal"/>
+    <w:uiPriority w:val="50"/>
+    <w:rsid w:val="00AA7070"/>
+    <w:tblPr>
+      <w:tblStyleRowBandSize w:val="1"/>
+      <w:tblStyleColBandSize w:val="1"/>
+      <w:tblBorders>
+        <w:top w:color="FFFFFF" w:space="0" w:sz="4" w:themeColor="background1" w:val="single"/>
+        <w:left w:color="FFFFFF" w:space="0" w:sz="4" w:themeColor="background1" w:val="single"/>
+        <w:bottom w:color="FFFFFF" w:space="0" w:sz="4" w:themeColor="background1" w:val="single"/>
+        <w:right w:color="FFFFFF" w:space="0" w:sz="4" w:themeColor="background1" w:val="single"/>
+        <w:insideH w:color="FFFFFF" w:space="0" w:sz="4" w:themeColor="background1" w:val="single"/>
+        <w:insideV w:color="FFFFFF" w:space="0" w:sz="4" w:themeColor="background1" w:val="single"/>
+      </w:tblBorders>
+    </w:tblPr>
+    <w:tcPr>
+      <w:shd w:color="auto" w:fill="DEEAF6" w:themeFill="accent5" w:themeFillTint="33" w:val="clear"/>
+    </w:tcPr>
+    <w:tblStylePr w:type="firstRow">
+      <w:rPr>
+        <w:b/>
+        <w:bCs/>
+        <w:color w:themeColor="background1" w:val="FFFFFF"/>
+      </w:rPr>
+      <w:tblPr/>
+      <w:tcPr>
+        <w:tcBorders>
+          <w:top w:color="FFFFFF" w:space="0" w:sz="4" w:themeColor="background1" w:val="single"/>
+          <w:left w:color="FFFFFF" w:space="0" w:sz="4" w:themeColor="background1" w:val="single"/>
+          <w:right w:color="FFFFFF" w:space="0" w:sz="4" w:themeColor="background1" w:val="single"/>
+          <w:insideH w:val="nil"/>
+          <w:insideV w:val="nil"/>
+        </w:tcBorders>
+        <w:shd w:color="auto" w:fill="5B9BD5" w:themeFill="accent5" w:val="clear"/>
+      </w:tcPr>
+    </w:tblStylePr>
+    <w:tblStylePr w:type="lastRow">
+      <w:rPr>
+        <w:b/>
+        <w:bCs/>
+        <w:color w:themeColor="background1" w:val="FFFFFF"/>
+      </w:rPr>
+      <w:tblPr/>
+      <w:tcPr>
+        <w:tcBorders>
+          <w:left w:color="FFFFFF" w:space="0" w:sz="4" w:themeColor="background1" w:val="single"/>
+          <w:bottom w:color="FFFFFF" w:space="0" w:sz="4" w:themeColor="background1" w:val="single"/>
+          <w:right w:color="FFFFFF" w:space="0" w:sz="4" w:themeColor="background1" w:val="single"/>
+          <w:insideH w:val="nil"/>
+          <w:insideV w:val="nil"/>
+        </w:tcBorders>
+        <w:shd w:color="auto" w:fill="5B9BD5" w:themeFill="accent5" w:val="clear"/>
+      </w:tcPr>
+    </w:tblStylePr>
+    <w:tblStylePr w:type="firstCol">
+      <w:rPr>
+        <w:b/>
+        <w:bCs/>
+        <w:color w:themeColor="background1" w:val="FFFFFF"/>
+      </w:rPr>
+      <w:tblPr/>
+      <w:tcPr>
+        <w:tcBorders>
+          <w:top w:color="FFFFFF" w:space="0" w:sz="4" w:themeColor="background1" w:val="single"/>
+          <w:left w:color="FFFFFF" w:space="0" w:sz="4" w:themeColor="background1" w:val="single"/>
+          <w:bottom w:color="FFFFFF" w:space="0" w:sz="4" w:themeColor="background1" w:val="single"/>
+          <w:insideV w:val="nil"/>
+        </w:tcBorders>
+        <w:shd w:color="auto" w:fill="5B9BD5" w:themeFill="accent5" w:val="clear"/>
+      </w:tcPr>
+    </w:tblStylePr>
+    <w:tblStylePr w:type="lastCol">
+      <w:rPr>
+        <w:b/>
+        <w:bCs/>
+        <w:color w:themeColor="background1" w:val="FFFFFF"/>
+      </w:rPr>
+      <w:tblPr/>
+      <w:tcPr>
+        <w:tcBorders>
+          <w:top w:color="FFFFFF" w:space="0" w:sz="4" w:themeColor="background1" w:val="single"/>
+          <w:bottom w:color="FFFFFF" w:space="0" w:sz="4" w:themeColor="background1" w:val="single"/>
+          <w:right w:color="FFFFFF" w:space="0" w:sz="4" w:themeColor="background1" w:val="single"/>
+          <w:insideV w:val="nil"/>
+        </w:tcBorders>
+        <w:shd w:color="auto" w:fill="5B9BD5" w:themeFill="accent5" w:val="clear"/>
+      </w:tcPr>
+    </w:tblStylePr>
+    <w:tblStylePr w:type="band1Vert">
+      <w:tblPr/>
+      <w:tcPr>
+        <w:shd w:color="auto" w:fill="BDD6EE" w:themeFill="accent5" w:themeFillTint="66" w:val="clear"/>
+      </w:tcPr>
+    </w:tblStylePr>
+    <w:tblStylePr w:type="band1Horz">
+      <w:tblPr/>
+      <w:tcPr>
+        <w:shd w:color="auto" w:fill="BDD6EE" w:themeFill="accent5" w:themeFillTint="66" w:val="clear"/>
+      </w:tcPr>
+    </w:tblStylePr>
+  </w:style>
+  <w:style w:styleId="GridTable4-Accent1" w:type="table">
+    <w:name w:val="Grid Table 4 Accent 1"/>
+    <w:basedOn w:val="TableNormal"/>
+    <w:uiPriority w:val="49"/>
+    <w:rsid w:val="00AA7070"/>
+    <w:tblPr>
+      <w:tblStyleRowBandSize w:val="1"/>
+      <w:tblStyleColBandSize w:val="1"/>
+      <w:tblBorders>
+        <w:top w:color="8EAADB" w:space="0" w:sz="4" w:themeColor="accent1" w:themeTint="99" w:val="single"/>
+        <w:left w:color="8EAADB" w:space="0" w:sz="4" w:themeColor="accent1" w:themeTint="99" w:val="single"/>
+        <w:bottom w:color="8EAADB" w:space="0" w:sz="4" w:themeColor="accent1" w:themeTint="99" w:val="single"/>
+        <w:right w:color="8EAADB" w:space="0" w:sz="4" w:themeColor="accent1" w:themeTint="99" w:val="single"/>
+        <w:insideH w:color="8EAADB" w:space="0" w:sz="4" w:themeColor="accent1" w:themeTint="99" w:val="single"/>
+        <w:insideV w:color="8EAADB" w:space="0" w:sz="4" w:themeColor="accent1" w:themeTint="99" w:val="single"/>
+      </w:tblBorders>
+    </w:tblPr>
+    <w:tblStylePr w:type="firstRow">
+      <w:rPr>
+        <w:b/>
+        <w:bCs/>
+        <w:color w:themeColor="background1" w:val="FFFFFF"/>
+      </w:rPr>
+      <w:tblPr/>
+      <w:tcPr>
+        <w:tcBorders>
+          <w:top w:color="4472C4" w:space="0" w:sz="4" w:themeColor="accent1" w:val="single"/>
+          <w:left w:color="4472C4" w:space="0" w:sz="4" w:themeColor="accent1" w:val="single"/>
+          <w:bottom w:color="4472C4" w:space="0" w:sz="4" w:themeColor="accent1" w:val="single"/>
+          <w:right w:color="4472C4" w:space="0" w:sz="4" w:themeColor="accent1" w:val="single"/>
+          <w:insideH w:val="nil"/>
+          <w:insideV w:val="nil"/>
+        </w:tcBorders>
+        <w:shd w:color="auto" w:fill="4472C4" w:themeFill="accent1" w:val="clear"/>
+      </w:tcPr>
+    </w:tblStylePr>
+    <w:tblStylePr w:type="lastRow">
+      <w:rPr>
+        <w:b/>
+        <w:bCs/>
+      </w:rPr>
+      <w:tblPr/>
+      <w:tcPr>
+        <w:tcBorders>
+          <w:top w:color="4472C4" w:space="0" w:sz="4" w:themeColor="accent1" w:val="double"/>
+        </w:tcBorders>
+      </w:tcPr>
+    </w:tblStylePr>
+    <w:tblStylePr w:type="firstCol">
+      <w:rPr>
+        <w:b/>
+        <w:bCs/>
+      </w:rPr>
+    </w:tblStylePr>
+    <w:tblStylePr w:type="lastCol">
+      <w:rPr>
+        <w:b/>
+        <w:bCs/>
+      </w:rPr>
+    </w:tblStylePr>
+    <w:tblStylePr w:type="band1Vert">
+      <w:tblPr/>
+      <w:tcPr>
+        <w:shd w:color="auto" w:fill="D9E2F3" w:themeFill="accent1" w:themeFillTint="33" w:val="clear"/>
+      </w:tcPr>
+    </w:tblStylePr>
+    <w:tblStylePr w:type="band1Horz">
+      <w:tblPr/>
+      <w:tcPr>
+        <w:shd w:color="auto" w:fill="D9E2F3" w:themeFill="accent1" w:themeFillTint="33" w:val="clear"/>
+      </w:tcPr>
+    </w:tblStylePr>
+  </w:style>
+  <w:style w:styleId="ListTable6Colorful-Accent1" w:type="table">
+    <w:name w:val="List Table 6 Colorful Accent 1"/>
+    <w:basedOn w:val="TableNormal"/>
+    <w:uiPriority w:val="51"/>
+    <w:rsid w:val="00AA7070"/>
+    <w:rPr>
+      <w:color w:themeColor="accent1" w:themeShade="BF" w:val="2F5496"/>
+    </w:rPr>
+    <w:tblPr>
+      <w:tblStyleRowBandSize w:val="1"/>
+      <w:tblStyleColBandSize w:val="1"/>
+      <w:tblBorders>
+        <w:top w:color="4472C4" w:space="0" w:sz="4" w:themeColor="accent1" w:val="single"/>
+        <w:bottom w:color="4472C4" w:space="0" w:sz="4" w:themeColor="accent1" w:val="single"/>
+      </w:tblBorders>
+    </w:tblPr>
+    <w:tblStylePr w:type="firstRow">
+      <w:rPr>
+        <w:b/>
+        <w:bCs/>
+      </w:rPr>
+      <w:tblPr/>
+      <w:tcPr>
+        <w:tcBorders>
+          <w:bottom w:color="4472C4" w:space="0" w:sz="4" w:themeColor="accent1" w:val="single"/>
+        </w:tcBorders>
+      </w:tcPr>
+    </w:tblStylePr>
+    <w:tblStylePr w:type="lastRow">
+      <w:rPr>
+        <w:b/>
+        <w:bCs/>
+      </w:rPr>
+      <w:tblPr/>
+      <w:tcPr>
+        <w:tcBorders>
+          <w:top w:color="4472C4" w:space="0" w:sz="4" w:themeColor="accent1" w:val="double"/>
+        </w:tcBorders>
+      </w:tcPr>
+    </w:tblStylePr>
+    <w:tblStylePr w:type="firstCol">
+      <w:rPr>
+        <w:b/>
+        <w:bCs/>
+      </w:rPr>
+    </w:tblStylePr>
+    <w:tblStylePr w:type="lastCol">
+      <w:rPr>
+        <w:b/>
+        <w:bCs/>
+      </w:rPr>
+    </w:tblStylePr>
+    <w:tblStylePr w:type="band1Vert">
+      <w:tblPr/>
+      <w:tcPr>
+        <w:shd w:color="auto" w:fill="D9E2F3" w:themeFill="accent1" w:themeFillTint="33" w:val="clear"/>
+      </w:tcPr>
+    </w:tblStylePr>
+    <w:tblStylePr w:type="band1Horz">
+      <w:tblPr/>
+      <w:tcPr>
+        <w:shd w:color="auto" w:fill="D9E2F3" w:themeFill="accent1" w:themeFillTint="33" w:val="clear"/>
+      </w:tcPr>
+    </w:tblStylePr>
   </w:style>
   <w:style w:type="paragraph" w:customStyle="1" w:styleId="SourceCode">
     <w:name w:val="Source Code"/>
@@ -1237,39 +1890,39 @@
         <a:sysClr val="window" lastClr="FFFFFF"/>
       </a:lt1>
       <a:dk2>
-        <a:srgbClr val="0E2841"/>
+        <a:srgbClr val="44546A"/>
       </a:dk2>
       <a:lt2>
-        <a:srgbClr val="E8E8E8"/>
+        <a:srgbClr val="E7E6E6"/>
       </a:lt2>
       <a:accent1>
-        <a:srgbClr val="156082"/>
+        <a:srgbClr val="4472C4"/>
       </a:accent1>
       <a:accent2>
-        <a:srgbClr val="E97132"/>
+        <a:srgbClr val="ED7D31"/>
       </a:accent2>
       <a:accent3>
-        <a:srgbClr val="196B24"/>
+        <a:srgbClr val="A5A5A5"/>
       </a:accent3>
       <a:accent4>
-        <a:srgbClr val="0F9ED5"/>
+        <a:srgbClr val="FFC000"/>
       </a:accent4>
       <a:accent5>
-        <a:srgbClr val="A02B93"/>
+        <a:srgbClr val="5B9BD5"/>
       </a:accent5>
       <a:accent6>
-        <a:srgbClr val="4EA72E"/>
+        <a:srgbClr val="70AD47"/>
       </a:accent6>
       <a:hlink>
-        <a:srgbClr val="467886"/>
+        <a:srgbClr val="0563C1"/>
       </a:hlink>
       <a:folHlink>
-        <a:srgbClr val="96607D"/>
+        <a:srgbClr val="954F72"/>
       </a:folHlink>
     </a:clrScheme>
     <a:fontScheme name="Office">
       <a:majorFont>
-        <a:latin typeface="Aptos Display" panose="02110004020202020204"/>
+        <a:latin typeface="Calibri Light" panose="020F0302020204030204"/>
         <a:ea typeface=""/>
         <a:cs typeface=""/>
         <a:font script="Jpan" typeface="游ゴシック Light"/>
@@ -1321,7 +1974,7 @@
         <a:font script="Tfng" typeface="Ebrima"/>
       </a:majorFont>
       <a:minorFont>
-        <a:latin typeface="Aptos" panose="02110004020202020204"/>
+        <a:latin typeface="Calibri" panose="020F0502020204030204"/>
         <a:ea typeface=""/>
         <a:cs typeface=""/>
         <a:font script="Jpan" typeface="游明朝"/>
@@ -1515,7 +2168,7 @@
   <a:extraClrSchemeLst/>
   <a:extLst>
     <a:ext uri="{05A4C25C-085E-4340-85A3-A5531E510DB2}">
-      <thm15:themeFamily xmlns:thm15="http://schemas.microsoft.com/office/thememl/2012/main" name="Office Theme" id="{2E142A2C-CD16-42D6-873A-C26D2A0506FA}" vid="{1BDDFF52-6CD6-40A5-AB3C-68EB2F1E4D0A}"/>
+      <thm15:themeFamily xmlns:thm15="http://schemas.microsoft.com/office/thememl/2012/main" name="Office Theme" id="{62F939B6-93AF-4DB8-9C6B-D6C7DFDC589F}" vid="{4A3C46E8-61CC-4603-A589-7422A47A8E4A}"/>
     </a:ext>
   </a:extLst>
 </a:theme>

</xml_diff>

<commit_message>
render entire document with TOC
</commit_message>
<xml_diff>
--- a/docs/chapter_downloads/Quintana_GoFish_AgentBased_Models.docx
+++ b/docs/chapter_downloads/Quintana_GoFish_AgentBased_Models.docx
@@ -1606,6 +1606,70 @@
       </w:tcPr>
     </w:tblStylePr>
   </w:style>
+  <w:style w:styleId="TOCHeading" w:type="paragraph">
+    <w:name w:val="TOC Heading"/>
+    <w:basedOn w:val="Heading1"/>
+    <w:next w:val="Normal"/>
+    <w:uiPriority w:val="39"/>
+    <w:unhideWhenUsed/>
+    <w:qFormat/>
+    <w:rsid w:val="00287085"/>
+    <w:pPr>
+      <w:keepNext/>
+      <w:keepLines/>
+      <w:pBdr>
+        <w:bottom w:color="auto" w:space="0" w:sz="0" w:val="none"/>
+      </w:pBdr>
+      <w:spacing w:after="0" w:before="240" w:line="259" w:lineRule="auto"/>
+      <w:outlineLvl w:val="9"/>
+    </w:pPr>
+    <w:rPr>
+      <w:rFonts w:asciiTheme="majorHAnsi" w:cstheme="majorBidi" w:eastAsiaTheme="majorEastAsia" w:hAnsiTheme="majorHAnsi"/>
+      <w:b w:val="0"/>
+      <w:bCs w:val="0"/>
+      <w:color w:themeColor="accent1" w:themeShade="BF" w:val="2F5496"/>
+      <w:sz w:val="32"/>
+      <w:szCs w:val="32"/>
+    </w:rPr>
+  </w:style>
+  <w:style w:styleId="TOC1" w:type="paragraph">
+    <w:name w:val="toc 1"/>
+    <w:basedOn w:val="Normal"/>
+    <w:next w:val="Normal"/>
+    <w:autoRedefine/>
+    <w:uiPriority w:val="39"/>
+    <w:unhideWhenUsed/>
+    <w:rsid w:val="00287085"/>
+    <w:pPr>
+      <w:spacing w:after="100"/>
+    </w:pPr>
+  </w:style>
+  <w:style w:styleId="TOC2" w:type="paragraph">
+    <w:name w:val="toc 2"/>
+    <w:basedOn w:val="Normal"/>
+    <w:next w:val="Normal"/>
+    <w:autoRedefine/>
+    <w:uiPriority w:val="39"/>
+    <w:unhideWhenUsed/>
+    <w:rsid w:val="00287085"/>
+    <w:pPr>
+      <w:spacing w:after="100"/>
+      <w:ind w:left="220"/>
+    </w:pPr>
+  </w:style>
+  <w:style w:styleId="TOC3" w:type="paragraph">
+    <w:name w:val="toc 3"/>
+    <w:basedOn w:val="Normal"/>
+    <w:next w:val="Normal"/>
+    <w:autoRedefine/>
+    <w:uiPriority w:val="39"/>
+    <w:unhideWhenUsed/>
+    <w:rsid w:val="00287085"/>
+    <w:pPr>
+      <w:spacing w:after="100"/>
+      <w:ind w:left="440"/>
+    </w:pPr>
+  </w:style>
   <w:style w:type="paragraph" w:customStyle="1" w:styleId="SourceCode">
     <w:name w:val="Source Code"/>
     <w:basedOn w:val="Normal"/>

</xml_diff>